<commit_message>
docs: finalize review document
</commit_message>
<xml_diff>
--- a/docs/G1_furniture-store_Review_1_2_3_EN.docx
+++ b/docs/G1_furniture-store_Review_1_2_3_EN.docx
@@ -164,30 +164,1698 @@
       </w:r>
     </w:p>
     <w:p>
+      <w:pPr>
+        <w:ind w:left="0" w:firstLine="0"/>
+        <w:tabs>
+          <w:tab w:val="right" w:pos="9000"/>
+        </w:tabs>
+      </w:pPr>
+      <w:hyperlink w:anchor="contents_section_001" w:history="1">
+        <w:r>
+          <w:rPr>
+            <w:rFonts w:ascii="Arial" w:hAnsi="Arial"/>
+            <w:color w:val="000000"/>
+            <w:sz w:val="18"/>
+            <w:u w:val="none"/>
+          </w:rPr>
+          <w:t>REVIEW 1</w:t>
+        </w:r>
+      </w:hyperlink>
       <w:r>
         <w:rPr>
           <w:rFonts w:ascii="Arial" w:hAnsi="Arial"/>
-          <w:b w:val="0"/>
           <w:color w:val="000000"/>
+          <w:sz w:val="17"/>
         </w:rPr>
-        <w:fldChar w:fldCharType="begin"/>
-        <w:instrText xml:space="preserve">TOC \o "1-3" \h \z \u</w:instrText>
+        <w:t>	</w:t>
+      </w:r>
+      <w:r>
+        <w:fldChar w:fldCharType="begin" w:dirty="true"/>
+      </w:r>
+      <w:r>
+        <w:instrText xml:space="preserve"> PAGEREF contents_section_001 \h </w:instrText>
+      </w:r>
+      <w:r>
         <w:fldChar w:fldCharType="separate"/>
-        <w:fldChar/>
+      </w:r>
+      <w:r>
+        <w:rPr>
+          <w:rFonts w:ascii="Arial" w:hAnsi="Arial"/>
+          <w:color w:val="000000"/>
+          <w:sz w:val="17"/>
+        </w:rPr>
+        <w:t/>
+      </w:r>
+      <w:r>
         <w:fldChar w:fldCharType="end"/>
       </w:r>
     </w:p>
     <w:p>
+      <w:pPr>
+        <w:ind w:left="360" w:firstLine="0"/>
+        <w:tabs>
+          <w:tab w:val="right" w:pos="9000"/>
+        </w:tabs>
+      </w:pPr>
+      <w:hyperlink w:anchor="contents_section_002" w:history="1">
+        <w:r>
+          <w:rPr>
+            <w:rFonts w:ascii="Arial" w:hAnsi="Arial"/>
+            <w:color w:val="000000"/>
+            <w:sz w:val="17"/>
+            <w:u w:val="none"/>
+          </w:rPr>
+          <w:t>1. PROBLEM STATEMENT</w:t>
+        </w:r>
+      </w:hyperlink>
       <w:r>
         <w:rPr>
           <w:rFonts w:ascii="Arial" w:hAnsi="Arial"/>
-          <w:b w:val="0"/>
           <w:color w:val="000000"/>
-          <w:sz w:val="18"/>
+          <w:sz w:val="17"/>
         </w:rPr>
-        <w:t>Headings in this document are clickable after Word or LibreOffice refreshes the table field.</w:t>
+        <w:t>	</w:t>
+      </w:r>
+      <w:r>
+        <w:fldChar w:fldCharType="begin" w:dirty="true"/>
+      </w:r>
+      <w:r>
+        <w:instrText xml:space="preserve"> PAGEREF contents_section_002 \h </w:instrText>
+      </w:r>
+      <w:r>
+        <w:fldChar w:fldCharType="separate"/>
+      </w:r>
+      <w:r>
+        <w:rPr>
+          <w:rFonts w:ascii="Arial" w:hAnsi="Arial"/>
+          <w:color w:val="000000"/>
+          <w:sz w:val="17"/>
+        </w:rPr>
+        <w:t/>
+      </w:r>
+      <w:r>
+        <w:fldChar w:fldCharType="end"/>
       </w:r>
     </w:p>
+    <w:p>
+      <w:pPr>
+        <w:ind w:left="360" w:firstLine="0"/>
+        <w:tabs>
+          <w:tab w:val="right" w:pos="9000"/>
+        </w:tabs>
+      </w:pPr>
+      <w:hyperlink w:anchor="contents_section_003" w:history="1">
+        <w:r>
+          <w:rPr>
+            <w:rFonts w:ascii="Arial" w:hAnsi="Arial"/>
+            <w:color w:val="000000"/>
+            <w:sz w:val="17"/>
+            <w:u w:val="none"/>
+          </w:rPr>
+          <w:t>2. PROJECT OBJECTIVES</w:t>
+        </w:r>
+      </w:hyperlink>
+      <w:r>
+        <w:rPr>
+          <w:rFonts w:ascii="Arial" w:hAnsi="Arial"/>
+          <w:color w:val="000000"/>
+          <w:sz w:val="17"/>
+        </w:rPr>
+        <w:t>	</w:t>
+      </w:r>
+      <w:r>
+        <w:fldChar w:fldCharType="begin" w:dirty="true"/>
+      </w:r>
+      <w:r>
+        <w:instrText xml:space="preserve"> PAGEREF contents_section_003 \h </w:instrText>
+      </w:r>
+      <w:r>
+        <w:fldChar w:fldCharType="separate"/>
+      </w:r>
+      <w:r>
+        <w:rPr>
+          <w:rFonts w:ascii="Arial" w:hAnsi="Arial"/>
+          <w:color w:val="000000"/>
+          <w:sz w:val="17"/>
+        </w:rPr>
+        <w:t/>
+      </w:r>
+      <w:r>
+        <w:fldChar w:fldCharType="end"/>
+      </w:r>
+    </w:p>
+    <w:p>
+      <w:pPr>
+        <w:ind w:left="360" w:firstLine="0"/>
+        <w:tabs>
+          <w:tab w:val="right" w:pos="9000"/>
+        </w:tabs>
+      </w:pPr>
+      <w:hyperlink w:anchor="contents_section_004" w:history="1">
+        <w:r>
+          <w:rPr>
+            <w:rFonts w:ascii="Arial" w:hAnsi="Arial"/>
+            <w:color w:val="000000"/>
+            <w:sz w:val="17"/>
+            <w:u w:val="none"/>
+          </w:rPr>
+          <w:t>3. TARGET USERS</w:t>
+        </w:r>
+      </w:hyperlink>
+      <w:r>
+        <w:rPr>
+          <w:rFonts w:ascii="Arial" w:hAnsi="Arial"/>
+          <w:color w:val="000000"/>
+          <w:sz w:val="17"/>
+        </w:rPr>
+        <w:t>	</w:t>
+      </w:r>
+      <w:r>
+        <w:fldChar w:fldCharType="begin" w:dirty="true"/>
+      </w:r>
+      <w:r>
+        <w:instrText xml:space="preserve"> PAGEREF contents_section_004 \h </w:instrText>
+      </w:r>
+      <w:r>
+        <w:fldChar w:fldCharType="separate"/>
+      </w:r>
+      <w:r>
+        <w:rPr>
+          <w:rFonts w:ascii="Arial" w:hAnsi="Arial"/>
+          <w:color w:val="000000"/>
+          <w:sz w:val="17"/>
+        </w:rPr>
+        <w:t/>
+      </w:r>
+      <w:r>
+        <w:fldChar w:fldCharType="end"/>
+      </w:r>
+    </w:p>
+    <w:p>
+      <w:pPr>
+        <w:ind w:left="360" w:firstLine="0"/>
+        <w:tabs>
+          <w:tab w:val="right" w:pos="9000"/>
+        </w:tabs>
+      </w:pPr>
+      <w:hyperlink w:anchor="contents_section_005" w:history="1">
+        <w:r>
+          <w:rPr>
+            <w:rFonts w:ascii="Arial" w:hAnsi="Arial"/>
+            <w:color w:val="000000"/>
+            <w:sz w:val="17"/>
+            <w:u w:val="none"/>
+          </w:rPr>
+          <w:t>4. PROBLEMS ADDRESSED</w:t>
+        </w:r>
+      </w:hyperlink>
+      <w:r>
+        <w:rPr>
+          <w:rFonts w:ascii="Arial" w:hAnsi="Arial"/>
+          <w:color w:val="000000"/>
+          <w:sz w:val="17"/>
+        </w:rPr>
+        <w:t>	</w:t>
+      </w:r>
+      <w:r>
+        <w:fldChar w:fldCharType="begin" w:dirty="true"/>
+      </w:r>
+      <w:r>
+        <w:instrText xml:space="preserve"> PAGEREF contents_section_005 \h </w:instrText>
+      </w:r>
+      <w:r>
+        <w:fldChar w:fldCharType="separate"/>
+      </w:r>
+      <w:r>
+        <w:rPr>
+          <w:rFonts w:ascii="Arial" w:hAnsi="Arial"/>
+          <w:color w:val="000000"/>
+          <w:sz w:val="17"/>
+        </w:rPr>
+        <w:t/>
+      </w:r>
+      <w:r>
+        <w:fldChar w:fldCharType="end"/>
+      </w:r>
+    </w:p>
+    <w:p>
+      <w:pPr>
+        <w:ind w:left="360" w:firstLine="0"/>
+        <w:tabs>
+          <w:tab w:val="right" w:pos="9000"/>
+        </w:tabs>
+      </w:pPr>
+      <w:hyperlink w:anchor="contents_section_006" w:history="1">
+        <w:r>
+          <w:rPr>
+            <w:rFonts w:ascii="Arial" w:hAnsi="Arial"/>
+            <w:color w:val="000000"/>
+            <w:sz w:val="17"/>
+            <w:u w:val="none"/>
+          </w:rPr>
+          <w:t>5. CUSTOMER REQUIREMENTS SPECIFICATION</w:t>
+        </w:r>
+      </w:hyperlink>
+      <w:r>
+        <w:rPr>
+          <w:rFonts w:ascii="Arial" w:hAnsi="Arial"/>
+          <w:color w:val="000000"/>
+          <w:sz w:val="17"/>
+        </w:rPr>
+        <w:t>	</w:t>
+      </w:r>
+      <w:r>
+        <w:fldChar w:fldCharType="begin" w:dirty="true"/>
+      </w:r>
+      <w:r>
+        <w:instrText xml:space="preserve"> PAGEREF contents_section_006 \h </w:instrText>
+      </w:r>
+      <w:r>
+        <w:fldChar w:fldCharType="separate"/>
+      </w:r>
+      <w:r>
+        <w:rPr>
+          <w:rFonts w:ascii="Arial" w:hAnsi="Arial"/>
+          <w:color w:val="000000"/>
+          <w:sz w:val="17"/>
+        </w:rPr>
+        <w:t/>
+      </w:r>
+      <w:r>
+        <w:fldChar w:fldCharType="end"/>
+      </w:r>
+    </w:p>
+    <w:p>
+      <w:pPr>
+        <w:ind w:left="360" w:firstLine="0"/>
+        <w:tabs>
+          <w:tab w:val="right" w:pos="9000"/>
+        </w:tabs>
+      </w:pPr>
+      <w:hyperlink w:anchor="contents_section_007" w:history="1">
+        <w:r>
+          <w:rPr>
+            <w:rFonts w:ascii="Arial" w:hAnsi="Arial"/>
+            <w:color w:val="000000"/>
+            <w:sz w:val="17"/>
+            <w:u w:val="none"/>
+          </w:rPr>
+          <w:t>6. GENERAL PROCESS: INPUT → PROCESS → OUTPUT</w:t>
+        </w:r>
+      </w:hyperlink>
+      <w:r>
+        <w:rPr>
+          <w:rFonts w:ascii="Arial" w:hAnsi="Arial"/>
+          <w:color w:val="000000"/>
+          <w:sz w:val="17"/>
+        </w:rPr>
+        <w:t>	</w:t>
+      </w:r>
+      <w:r>
+        <w:fldChar w:fldCharType="begin" w:dirty="true"/>
+      </w:r>
+      <w:r>
+        <w:instrText xml:space="preserve"> PAGEREF contents_section_007 \h </w:instrText>
+      </w:r>
+      <w:r>
+        <w:fldChar w:fldCharType="separate"/>
+      </w:r>
+      <w:r>
+        <w:rPr>
+          <w:rFonts w:ascii="Arial" w:hAnsi="Arial"/>
+          <w:color w:val="000000"/>
+          <w:sz w:val="17"/>
+        </w:rPr>
+        <w:t/>
+      </w:r>
+      <w:r>
+        <w:fldChar w:fldCharType="end"/>
+      </w:r>
+    </w:p>
+    <w:p>
+      <w:pPr>
+        <w:ind w:left="360" w:firstLine="0"/>
+        <w:tabs>
+          <w:tab w:val="right" w:pos="9000"/>
+        </w:tabs>
+      </w:pPr>
+      <w:hyperlink w:anchor="contents_section_008" w:history="1">
+        <w:r>
+          <w:rPr>
+            <w:rFonts w:ascii="Arial" w:hAnsi="Arial"/>
+            <w:color w:val="000000"/>
+            <w:sz w:val="17"/>
+            <w:u w:val="none"/>
+          </w:rPr>
+          <w:t>7. CLIENT HARDWARE AND SOFTWARE REQUIREMENTS</w:t>
+        </w:r>
+      </w:hyperlink>
+      <w:r>
+        <w:rPr>
+          <w:rFonts w:ascii="Arial" w:hAnsi="Arial"/>
+          <w:color w:val="000000"/>
+          <w:sz w:val="17"/>
+        </w:rPr>
+        <w:t>	</w:t>
+      </w:r>
+      <w:r>
+        <w:fldChar w:fldCharType="begin" w:dirty="true"/>
+      </w:r>
+      <w:r>
+        <w:instrText xml:space="preserve"> PAGEREF contents_section_008 \h </w:instrText>
+      </w:r>
+      <w:r>
+        <w:fldChar w:fldCharType="separate"/>
+      </w:r>
+      <w:r>
+        <w:rPr>
+          <w:rFonts w:ascii="Arial" w:hAnsi="Arial"/>
+          <w:color w:val="000000"/>
+          <w:sz w:val="17"/>
+        </w:rPr>
+        <w:t/>
+      </w:r>
+      <w:r>
+        <w:fldChar w:fldCharType="end"/>
+      </w:r>
+    </w:p>
+    <w:p>
+      <w:pPr>
+        <w:ind w:left="360" w:firstLine="0"/>
+        <w:tabs>
+          <w:tab w:val="right" w:pos="9000"/>
+        </w:tabs>
+      </w:pPr>
+      <w:hyperlink w:anchor="contents_section_009" w:history="1">
+        <w:r>
+          <w:rPr>
+            <w:rFonts w:ascii="Arial" w:hAnsi="Arial"/>
+            <w:color w:val="000000"/>
+            <w:sz w:val="17"/>
+            <w:u w:val="none"/>
+          </w:rPr>
+          <w:t>8. SYSTEM FUNCTION DESCRIPTION</w:t>
+        </w:r>
+      </w:hyperlink>
+      <w:r>
+        <w:rPr>
+          <w:rFonts w:ascii="Arial" w:hAnsi="Arial"/>
+          <w:color w:val="000000"/>
+          <w:sz w:val="17"/>
+        </w:rPr>
+        <w:t>	</w:t>
+      </w:r>
+      <w:r>
+        <w:fldChar w:fldCharType="begin" w:dirty="true"/>
+      </w:r>
+      <w:r>
+        <w:instrText xml:space="preserve"> PAGEREF contents_section_009 \h </w:instrText>
+      </w:r>
+      <w:r>
+        <w:fldChar w:fldCharType="separate"/>
+      </w:r>
+      <w:r>
+        <w:rPr>
+          <w:rFonts w:ascii="Arial" w:hAnsi="Arial"/>
+          <w:color w:val="000000"/>
+          <w:sz w:val="17"/>
+        </w:rPr>
+        <w:t/>
+      </w:r>
+      <w:r>
+        <w:fldChar w:fldCharType="end"/>
+      </w:r>
+    </w:p>
+    <w:p>
+      <w:pPr>
+        <w:ind w:left="360" w:firstLine="0"/>
+        <w:tabs>
+          <w:tab w:val="right" w:pos="9000"/>
+        </w:tabs>
+      </w:pPr>
+      <w:hyperlink w:anchor="contents_section_010" w:history="1">
+        <w:r>
+          <w:rPr>
+            <w:rFonts w:ascii="Arial" w:hAnsi="Arial"/>
+            <w:color w:val="000000"/>
+            <w:sz w:val="17"/>
+            <w:u w:val="none"/>
+          </w:rPr>
+          <w:t>9. TASK ASSIGNMENT</w:t>
+        </w:r>
+      </w:hyperlink>
+      <w:r>
+        <w:rPr>
+          <w:rFonts w:ascii="Arial" w:hAnsi="Arial"/>
+          <w:color w:val="000000"/>
+          <w:sz w:val="17"/>
+        </w:rPr>
+        <w:t>	</w:t>
+      </w:r>
+      <w:r>
+        <w:fldChar w:fldCharType="begin" w:dirty="true"/>
+      </w:r>
+      <w:r>
+        <w:instrText xml:space="preserve"> PAGEREF contents_section_010 \h </w:instrText>
+      </w:r>
+      <w:r>
+        <w:fldChar w:fldCharType="separate"/>
+      </w:r>
+      <w:r>
+        <w:rPr>
+          <w:rFonts w:ascii="Arial" w:hAnsi="Arial"/>
+          <w:color w:val="000000"/>
+          <w:sz w:val="17"/>
+        </w:rPr>
+        <w:t/>
+      </w:r>
+      <w:r>
+        <w:fldChar w:fldCharType="end"/>
+      </w:r>
+    </w:p>
+    <w:p>
+      <w:pPr>
+        <w:ind w:left="0" w:firstLine="0"/>
+        <w:tabs>
+          <w:tab w:val="right" w:pos="9000"/>
+        </w:tabs>
+      </w:pPr>
+      <w:hyperlink w:anchor="contents_section_011" w:history="1">
+        <w:r>
+          <w:rPr>
+            <w:rFonts w:ascii="Arial" w:hAnsi="Arial"/>
+            <w:color w:val="000000"/>
+            <w:sz w:val="18"/>
+            <w:u w:val="none"/>
+          </w:rPr>
+          <w:t>REVIEW 2</w:t>
+        </w:r>
+      </w:hyperlink>
+      <w:r>
+        <w:rPr>
+          <w:rFonts w:ascii="Arial" w:hAnsi="Arial"/>
+          <w:color w:val="000000"/>
+          <w:sz w:val="17"/>
+        </w:rPr>
+        <w:t>	</w:t>
+      </w:r>
+      <w:r>
+        <w:fldChar w:fldCharType="begin" w:dirty="true"/>
+      </w:r>
+      <w:r>
+        <w:instrText xml:space="preserve"> PAGEREF contents_section_011 \h </w:instrText>
+      </w:r>
+      <w:r>
+        <w:fldChar w:fldCharType="separate"/>
+      </w:r>
+      <w:r>
+        <w:rPr>
+          <w:rFonts w:ascii="Arial" w:hAnsi="Arial"/>
+          <w:color w:val="000000"/>
+          <w:sz w:val="17"/>
+        </w:rPr>
+        <w:t/>
+      </w:r>
+      <w:r>
+        <w:fldChar w:fldCharType="end"/>
+      </w:r>
+    </w:p>
+    <w:p>
+      <w:pPr>
+        <w:ind w:left="360" w:firstLine="0"/>
+        <w:tabs>
+          <w:tab w:val="right" w:pos="9000"/>
+        </w:tabs>
+      </w:pPr>
+      <w:hyperlink w:anchor="contents_section_012" w:history="1">
+        <w:r>
+          <w:rPr>
+            <w:rFonts w:ascii="Arial" w:hAnsi="Arial"/>
+            <w:color w:val="000000"/>
+            <w:sz w:val="17"/>
+            <w:u w:val="none"/>
+          </w:rPr>
+          <w:t>1. FUNCTIONAL REQUIREMENTS: TEXT AND FLOWCHART</w:t>
+        </w:r>
+      </w:hyperlink>
+      <w:r>
+        <w:rPr>
+          <w:rFonts w:ascii="Arial" w:hAnsi="Arial"/>
+          <w:color w:val="000000"/>
+          <w:sz w:val="17"/>
+        </w:rPr>
+        <w:t>	</w:t>
+      </w:r>
+      <w:r>
+        <w:fldChar w:fldCharType="begin" w:dirty="true"/>
+      </w:r>
+      <w:r>
+        <w:instrText xml:space="preserve"> PAGEREF contents_section_012 \h </w:instrText>
+      </w:r>
+      <w:r>
+        <w:fldChar w:fldCharType="separate"/>
+      </w:r>
+      <w:r>
+        <w:rPr>
+          <w:rFonts w:ascii="Arial" w:hAnsi="Arial"/>
+          <w:color w:val="000000"/>
+          <w:sz w:val="17"/>
+        </w:rPr>
+        <w:t/>
+      </w:r>
+      <w:r>
+        <w:fldChar w:fldCharType="end"/>
+      </w:r>
+    </w:p>
+    <w:p>
+      <w:pPr>
+        <w:ind w:left="360" w:firstLine="0"/>
+        <w:tabs>
+          <w:tab w:val="right" w:pos="9000"/>
+        </w:tabs>
+      </w:pPr>
+      <w:hyperlink w:anchor="contents_section_013" w:history="1">
+        <w:r>
+          <w:rPr>
+            <w:rFonts w:ascii="Arial" w:hAnsi="Arial"/>
+            <w:color w:val="000000"/>
+            <w:sz w:val="17"/>
+            <w:u w:val="none"/>
+          </w:rPr>
+          <w:t>2. DATA FLOW DIAGRAM</w:t>
+        </w:r>
+      </w:hyperlink>
+      <w:r>
+        <w:rPr>
+          <w:rFonts w:ascii="Arial" w:hAnsi="Arial"/>
+          <w:color w:val="000000"/>
+          <w:sz w:val="17"/>
+        </w:rPr>
+        <w:t>	</w:t>
+      </w:r>
+      <w:r>
+        <w:fldChar w:fldCharType="begin" w:dirty="true"/>
+      </w:r>
+      <w:r>
+        <w:instrText xml:space="preserve"> PAGEREF contents_section_013 \h </w:instrText>
+      </w:r>
+      <w:r>
+        <w:fldChar w:fldCharType="separate"/>
+      </w:r>
+      <w:r>
+        <w:rPr>
+          <w:rFonts w:ascii="Arial" w:hAnsi="Arial"/>
+          <w:color w:val="000000"/>
+          <w:sz w:val="17"/>
+        </w:rPr>
+        <w:t/>
+      </w:r>
+      <w:r>
+        <w:fldChar w:fldCharType="end"/>
+      </w:r>
+    </w:p>
+    <w:p>
+      <w:pPr>
+        <w:ind w:left="720" w:firstLine="0"/>
+        <w:tabs>
+          <w:tab w:val="right" w:pos="9000"/>
+        </w:tabs>
+      </w:pPr>
+      <w:hyperlink w:anchor="contents_section_014" w:history="1">
+        <w:r>
+          <w:rPr>
+            <w:rFonts w:ascii="Arial" w:hAnsi="Arial"/>
+            <w:color w:val="000000"/>
+            <w:sz w:val="17"/>
+            <w:u w:val="none"/>
+          </w:rPr>
+          <w:t>2.1 DFD Level 0 – Context</w:t>
+        </w:r>
+      </w:hyperlink>
+      <w:r>
+        <w:rPr>
+          <w:rFonts w:ascii="Arial" w:hAnsi="Arial"/>
+          <w:color w:val="000000"/>
+          <w:sz w:val="17"/>
+        </w:rPr>
+        <w:t>	</w:t>
+      </w:r>
+      <w:r>
+        <w:fldChar w:fldCharType="begin" w:dirty="true"/>
+      </w:r>
+      <w:r>
+        <w:instrText xml:space="preserve"> PAGEREF contents_section_014 \h </w:instrText>
+      </w:r>
+      <w:r>
+        <w:fldChar w:fldCharType="separate"/>
+      </w:r>
+      <w:r>
+        <w:rPr>
+          <w:rFonts w:ascii="Arial" w:hAnsi="Arial"/>
+          <w:color w:val="000000"/>
+          <w:sz w:val="17"/>
+        </w:rPr>
+        <w:t/>
+      </w:r>
+      <w:r>
+        <w:fldChar w:fldCharType="end"/>
+      </w:r>
+    </w:p>
+    <w:p>
+      <w:pPr>
+        <w:ind w:left="720" w:firstLine="0"/>
+        <w:tabs>
+          <w:tab w:val="right" w:pos="9000"/>
+        </w:tabs>
+      </w:pPr>
+      <w:hyperlink w:anchor="contents_section_015" w:history="1">
+        <w:r>
+          <w:rPr>
+            <w:rFonts w:ascii="Arial" w:hAnsi="Arial"/>
+            <w:color w:val="000000"/>
+            <w:sz w:val="17"/>
+            <w:u w:val="none"/>
+          </w:rPr>
+          <w:t>2.2 DFD Level 1 – Main processes</w:t>
+        </w:r>
+      </w:hyperlink>
+      <w:r>
+        <w:rPr>
+          <w:rFonts w:ascii="Arial" w:hAnsi="Arial"/>
+          <w:color w:val="000000"/>
+          <w:sz w:val="17"/>
+        </w:rPr>
+        <w:t>	</w:t>
+      </w:r>
+      <w:r>
+        <w:fldChar w:fldCharType="begin" w:dirty="true"/>
+      </w:r>
+      <w:r>
+        <w:instrText xml:space="preserve"> PAGEREF contents_section_015 \h </w:instrText>
+      </w:r>
+      <w:r>
+        <w:fldChar w:fldCharType="separate"/>
+      </w:r>
+      <w:r>
+        <w:rPr>
+          <w:rFonts w:ascii="Arial" w:hAnsi="Arial"/>
+          <w:color w:val="000000"/>
+          <w:sz w:val="17"/>
+        </w:rPr>
+        <w:t/>
+      </w:r>
+      <w:r>
+        <w:fldChar w:fldCharType="end"/>
+      </w:r>
+    </w:p>
+    <w:p>
+      <w:pPr>
+        <w:ind w:left="720" w:firstLine="0"/>
+        <w:tabs>
+          <w:tab w:val="right" w:pos="9000"/>
+        </w:tabs>
+      </w:pPr>
+      <w:hyperlink w:anchor="contents_section_016" w:history="1">
+        <w:r>
+          <w:rPr>
+            <w:rFonts w:ascii="Arial" w:hAnsi="Arial"/>
+            <w:color w:val="000000"/>
+            <w:sz w:val="17"/>
+            <w:u w:val="none"/>
+          </w:rPr>
+          <w:t>2.3 DFD Level 2 – Orders and reviews</w:t>
+        </w:r>
+      </w:hyperlink>
+      <w:r>
+        <w:rPr>
+          <w:rFonts w:ascii="Arial" w:hAnsi="Arial"/>
+          <w:color w:val="000000"/>
+          <w:sz w:val="17"/>
+        </w:rPr>
+        <w:t>	</w:t>
+      </w:r>
+      <w:r>
+        <w:fldChar w:fldCharType="begin" w:dirty="true"/>
+      </w:r>
+      <w:r>
+        <w:instrText xml:space="preserve"> PAGEREF contents_section_016 \h </w:instrText>
+      </w:r>
+      <w:r>
+        <w:fldChar w:fldCharType="separate"/>
+      </w:r>
+      <w:r>
+        <w:rPr>
+          <w:rFonts w:ascii="Arial" w:hAnsi="Arial"/>
+          <w:color w:val="000000"/>
+          <w:sz w:val="17"/>
+        </w:rPr>
+        <w:t/>
+      </w:r>
+      <w:r>
+        <w:fldChar w:fldCharType="end"/>
+      </w:r>
+    </w:p>
+    <w:p>
+      <w:pPr>
+        <w:ind w:left="360" w:firstLine="0"/>
+        <w:tabs>
+          <w:tab w:val="right" w:pos="9000"/>
+        </w:tabs>
+      </w:pPr>
+      <w:hyperlink w:anchor="contents_section_017" w:history="1">
+        <w:r>
+          <w:rPr>
+            <w:rFonts w:ascii="Arial" w:hAnsi="Arial"/>
+            <w:color w:val="000000"/>
+            <w:sz w:val="17"/>
+            <w:u w:val="none"/>
+          </w:rPr>
+          <w:t>3. FUNCTIONAL DIAGRAM</w:t>
+        </w:r>
+      </w:hyperlink>
+      <w:r>
+        <w:rPr>
+          <w:rFonts w:ascii="Arial" w:hAnsi="Arial"/>
+          <w:color w:val="000000"/>
+          <w:sz w:val="17"/>
+        </w:rPr>
+        <w:t>	</w:t>
+      </w:r>
+      <w:r>
+        <w:fldChar w:fldCharType="begin" w:dirty="true"/>
+      </w:r>
+      <w:r>
+        <w:instrText xml:space="preserve"> PAGEREF contents_section_017 \h </w:instrText>
+      </w:r>
+      <w:r>
+        <w:fldChar w:fldCharType="separate"/>
+      </w:r>
+      <w:r>
+        <w:rPr>
+          <w:rFonts w:ascii="Arial" w:hAnsi="Arial"/>
+          <w:color w:val="000000"/>
+          <w:sz w:val="17"/>
+        </w:rPr>
+        <w:t/>
+      </w:r>
+      <w:r>
+        <w:fldChar w:fldCharType="end"/>
+      </w:r>
+    </w:p>
+    <w:p>
+      <w:pPr>
+        <w:ind w:left="360" w:firstLine="0"/>
+        <w:tabs>
+          <w:tab w:val="right" w:pos="9000"/>
+        </w:tabs>
+      </w:pPr>
+      <w:hyperlink w:anchor="contents_section_018" w:history="1">
+        <w:r>
+          <w:rPr>
+            <w:rFonts w:ascii="Arial" w:hAnsi="Arial"/>
+            <w:color w:val="000000"/>
+            <w:sz w:val="17"/>
+            <w:u w:val="none"/>
+          </w:rPr>
+          <w:t>4. DATA STRUCTURE – MONGODB</w:t>
+        </w:r>
+      </w:hyperlink>
+      <w:r>
+        <w:rPr>
+          <w:rFonts w:ascii="Arial" w:hAnsi="Arial"/>
+          <w:color w:val="000000"/>
+          <w:sz w:val="17"/>
+        </w:rPr>
+        <w:t>	</w:t>
+      </w:r>
+      <w:r>
+        <w:fldChar w:fldCharType="begin" w:dirty="true"/>
+      </w:r>
+      <w:r>
+        <w:instrText xml:space="preserve"> PAGEREF contents_section_018 \h </w:instrText>
+      </w:r>
+      <w:r>
+        <w:fldChar w:fldCharType="separate"/>
+      </w:r>
+      <w:r>
+        <w:rPr>
+          <w:rFonts w:ascii="Arial" w:hAnsi="Arial"/>
+          <w:color w:val="000000"/>
+          <w:sz w:val="17"/>
+        </w:rPr>
+        <w:t/>
+      </w:r>
+      <w:r>
+        <w:fldChar w:fldCharType="end"/>
+      </w:r>
+    </w:p>
+    <w:p>
+      <w:pPr>
+        <w:ind w:left="360" w:firstLine="0"/>
+        <w:tabs>
+          <w:tab w:val="right" w:pos="9000"/>
+        </w:tabs>
+      </w:pPr>
+      <w:hyperlink w:anchor="contents_section_019" w:history="1">
+        <w:r>
+          <w:rPr>
+            <w:rFonts w:ascii="Arial" w:hAnsi="Arial"/>
+            <w:color w:val="000000"/>
+            <w:sz w:val="17"/>
+            <w:u w:val="none"/>
+          </w:rPr>
+          <w:t>5. SITE MAP</w:t>
+        </w:r>
+      </w:hyperlink>
+      <w:r>
+        <w:rPr>
+          <w:rFonts w:ascii="Arial" w:hAnsi="Arial"/>
+          <w:color w:val="000000"/>
+          <w:sz w:val="17"/>
+        </w:rPr>
+        <w:t>	</w:t>
+      </w:r>
+      <w:r>
+        <w:fldChar w:fldCharType="begin" w:dirty="true"/>
+      </w:r>
+      <w:r>
+        <w:instrText xml:space="preserve"> PAGEREF contents_section_019 \h </w:instrText>
+      </w:r>
+      <w:r>
+        <w:fldChar w:fldCharType="separate"/>
+      </w:r>
+      <w:r>
+        <w:rPr>
+          <w:rFonts w:ascii="Arial" w:hAnsi="Arial"/>
+          <w:color w:val="000000"/>
+          <w:sz w:val="17"/>
+        </w:rPr>
+        <w:t/>
+      </w:r>
+      <w:r>
+        <w:fldChar w:fldCharType="end"/>
+      </w:r>
+    </w:p>
+    <w:p>
+      <w:pPr>
+        <w:ind w:left="0" w:firstLine="0"/>
+        <w:tabs>
+          <w:tab w:val="right" w:pos="9000"/>
+        </w:tabs>
+      </w:pPr>
+      <w:hyperlink w:anchor="contents_section_020" w:history="1">
+        <w:r>
+          <w:rPr>
+            <w:rFonts w:ascii="Arial" w:hAnsi="Arial"/>
+            <w:color w:val="000000"/>
+            <w:sz w:val="18"/>
+            <w:u w:val="none"/>
+          </w:rPr>
+          <w:t>REVIEW 3</w:t>
+        </w:r>
+      </w:hyperlink>
+      <w:r>
+        <w:rPr>
+          <w:rFonts w:ascii="Arial" w:hAnsi="Arial"/>
+          <w:color w:val="000000"/>
+          <w:sz w:val="17"/>
+        </w:rPr>
+        <w:t>	</w:t>
+      </w:r>
+      <w:r>
+        <w:fldChar w:fldCharType="begin" w:dirty="true"/>
+      </w:r>
+      <w:r>
+        <w:instrText xml:space="preserve"> PAGEREF contents_section_020 \h </w:instrText>
+      </w:r>
+      <w:r>
+        <w:fldChar w:fldCharType="separate"/>
+      </w:r>
+      <w:r>
+        <w:rPr>
+          <w:rFonts w:ascii="Arial" w:hAnsi="Arial"/>
+          <w:color w:val="000000"/>
+          <w:sz w:val="17"/>
+        </w:rPr>
+        <w:t/>
+      </w:r>
+      <w:r>
+        <w:fldChar w:fldCharType="end"/>
+      </w:r>
+    </w:p>
+    <w:p>
+      <w:pPr>
+        <w:ind w:left="360" w:firstLine="0"/>
+        <w:tabs>
+          <w:tab w:val="right" w:pos="9000"/>
+        </w:tabs>
+      </w:pPr>
+      <w:hyperlink w:anchor="contents_section_021" w:history="1">
+        <w:r>
+          <w:rPr>
+            <w:rFonts w:ascii="Arial" w:hAnsi="Arial"/>
+            <w:color w:val="000000"/>
+            <w:sz w:val="17"/>
+            <w:u w:val="none"/>
+          </w:rPr>
+          <w:t>1. REVIEW 3 SCOPE</w:t>
+        </w:r>
+      </w:hyperlink>
+      <w:r>
+        <w:rPr>
+          <w:rFonts w:ascii="Arial" w:hAnsi="Arial"/>
+          <w:color w:val="000000"/>
+          <w:sz w:val="17"/>
+        </w:rPr>
+        <w:t>	</w:t>
+      </w:r>
+      <w:r>
+        <w:fldChar w:fldCharType="begin" w:dirty="true"/>
+      </w:r>
+      <w:r>
+        <w:instrText xml:space="preserve"> PAGEREF contents_section_021 \h </w:instrText>
+      </w:r>
+      <w:r>
+        <w:fldChar w:fldCharType="separate"/>
+      </w:r>
+      <w:r>
+        <w:rPr>
+          <w:rFonts w:ascii="Arial" w:hAnsi="Arial"/>
+          <w:color w:val="000000"/>
+          <w:sz w:val="17"/>
+        </w:rPr>
+        <w:t/>
+      </w:r>
+      <w:r>
+        <w:fldChar w:fldCharType="end"/>
+      </w:r>
+    </w:p>
+    <w:p>
+      <w:pPr>
+        <w:ind w:left="360" w:firstLine="0"/>
+        <w:tabs>
+          <w:tab w:val="right" w:pos="9000"/>
+        </w:tabs>
+      </w:pPr>
+      <w:hyperlink w:anchor="contents_section_022" w:history="1">
+        <w:r>
+          <w:rPr>
+            <w:rFonts w:ascii="Arial" w:hAnsi="Arial"/>
+            <w:color w:val="000000"/>
+            <w:sz w:val="17"/>
+            <w:u w:val="none"/>
+          </w:rPr>
+          <w:t>2. SHARED LAYOUT AND AUTHENTICATION</w:t>
+        </w:r>
+      </w:hyperlink>
+      <w:r>
+        <w:rPr>
+          <w:rFonts w:ascii="Arial" w:hAnsi="Arial"/>
+          <w:color w:val="000000"/>
+          <w:sz w:val="17"/>
+        </w:rPr>
+        <w:t>	</w:t>
+      </w:r>
+      <w:r>
+        <w:fldChar w:fldCharType="begin" w:dirty="true"/>
+      </w:r>
+      <w:r>
+        <w:instrText xml:space="preserve"> PAGEREF contents_section_022 \h </w:instrText>
+      </w:r>
+      <w:r>
+        <w:fldChar w:fldCharType="separate"/>
+      </w:r>
+      <w:r>
+        <w:rPr>
+          <w:rFonts w:ascii="Arial" w:hAnsi="Arial"/>
+          <w:color w:val="000000"/>
+          <w:sz w:val="17"/>
+        </w:rPr>
+        <w:t/>
+      </w:r>
+      <w:r>
+        <w:fldChar w:fldCharType="end"/>
+      </w:r>
+    </w:p>
+    <w:p>
+      <w:pPr>
+        <w:ind w:left="360" w:firstLine="0"/>
+        <w:tabs>
+          <w:tab w:val="right" w:pos="9000"/>
+        </w:tabs>
+      </w:pPr>
+      <w:hyperlink w:anchor="contents_section_023" w:history="1">
+        <w:r>
+          <w:rPr>
+            <w:rFonts w:ascii="Arial" w:hAnsi="Arial"/>
+            <w:color w:val="000000"/>
+            <w:sz w:val="17"/>
+            <w:u w:val="none"/>
+          </w:rPr>
+          <w:t>3. HOME PAGE – /</w:t>
+        </w:r>
+      </w:hyperlink>
+      <w:r>
+        <w:rPr>
+          <w:rFonts w:ascii="Arial" w:hAnsi="Arial"/>
+          <w:color w:val="000000"/>
+          <w:sz w:val="17"/>
+        </w:rPr>
+        <w:t>	</w:t>
+      </w:r>
+      <w:r>
+        <w:fldChar w:fldCharType="begin" w:dirty="true"/>
+      </w:r>
+      <w:r>
+        <w:instrText xml:space="preserve"> PAGEREF contents_section_023 \h </w:instrText>
+      </w:r>
+      <w:r>
+        <w:fldChar w:fldCharType="separate"/>
+      </w:r>
+      <w:r>
+        <w:rPr>
+          <w:rFonts w:ascii="Arial" w:hAnsi="Arial"/>
+          <w:color w:val="000000"/>
+          <w:sz w:val="17"/>
+        </w:rPr>
+        <w:t/>
+      </w:r>
+      <w:r>
+        <w:fldChar w:fldCharType="end"/>
+      </w:r>
+    </w:p>
+    <w:p>
+      <w:pPr>
+        <w:ind w:left="360" w:firstLine="0"/>
+        <w:tabs>
+          <w:tab w:val="right" w:pos="9000"/>
+        </w:tabs>
+      </w:pPr>
+      <w:hyperlink w:anchor="contents_section_024" w:history="1">
+        <w:r>
+          <w:rPr>
+            <w:rFonts w:ascii="Arial" w:hAnsi="Arial"/>
+            <w:color w:val="000000"/>
+            <w:sz w:val="17"/>
+            <w:u w:val="none"/>
+          </w:rPr>
+          <w:t>4. PRODUCT LIST PAGE – /products</w:t>
+        </w:r>
+      </w:hyperlink>
+      <w:r>
+        <w:rPr>
+          <w:rFonts w:ascii="Arial" w:hAnsi="Arial"/>
+          <w:color w:val="000000"/>
+          <w:sz w:val="17"/>
+        </w:rPr>
+        <w:t>	</w:t>
+      </w:r>
+      <w:r>
+        <w:fldChar w:fldCharType="begin" w:dirty="true"/>
+      </w:r>
+      <w:r>
+        <w:instrText xml:space="preserve"> PAGEREF contents_section_024 \h </w:instrText>
+      </w:r>
+      <w:r>
+        <w:fldChar w:fldCharType="separate"/>
+      </w:r>
+      <w:r>
+        <w:rPr>
+          <w:rFonts w:ascii="Arial" w:hAnsi="Arial"/>
+          <w:color w:val="000000"/>
+          <w:sz w:val="17"/>
+        </w:rPr>
+        <w:t/>
+      </w:r>
+      <w:r>
+        <w:fldChar w:fldCharType="end"/>
+      </w:r>
+    </w:p>
+    <w:p>
+      <w:pPr>
+        <w:ind w:left="360" w:firstLine="0"/>
+        <w:tabs>
+          <w:tab w:val="right" w:pos="9000"/>
+        </w:tabs>
+      </w:pPr>
+      <w:hyperlink w:anchor="contents_section_025" w:history="1">
+        <w:r>
+          <w:rPr>
+            <w:rFonts w:ascii="Arial" w:hAnsi="Arial"/>
+            <w:color w:val="000000"/>
+            <w:sz w:val="17"/>
+            <w:u w:val="none"/>
+          </w:rPr>
+          <w:t>5. PRODUCT DETAIL PAGE – /products/:id</w:t>
+        </w:r>
+      </w:hyperlink>
+      <w:r>
+        <w:rPr>
+          <w:rFonts w:ascii="Arial" w:hAnsi="Arial"/>
+          <w:color w:val="000000"/>
+          <w:sz w:val="17"/>
+        </w:rPr>
+        <w:t>	</w:t>
+      </w:r>
+      <w:r>
+        <w:fldChar w:fldCharType="begin" w:dirty="true"/>
+      </w:r>
+      <w:r>
+        <w:instrText xml:space="preserve"> PAGEREF contents_section_025 \h </w:instrText>
+      </w:r>
+      <w:r>
+        <w:fldChar w:fldCharType="separate"/>
+      </w:r>
+      <w:r>
+        <w:rPr>
+          <w:rFonts w:ascii="Arial" w:hAnsi="Arial"/>
+          <w:color w:val="000000"/>
+          <w:sz w:val="17"/>
+        </w:rPr>
+        <w:t/>
+      </w:r>
+      <w:r>
+        <w:fldChar w:fldCharType="end"/>
+      </w:r>
+    </w:p>
+    <w:p>
+      <w:pPr>
+        <w:ind w:left="360" w:firstLine="0"/>
+        <w:tabs>
+          <w:tab w:val="right" w:pos="9000"/>
+        </w:tabs>
+      </w:pPr>
+      <w:hyperlink w:anchor="contents_section_026" w:history="1">
+        <w:r>
+          <w:rPr>
+            <w:rFonts w:ascii="Arial" w:hAnsi="Arial"/>
+            <w:color w:val="000000"/>
+            <w:sz w:val="17"/>
+            <w:u w:val="none"/>
+          </w:rPr>
+          <w:t>6. CART PAGE – /cart</w:t>
+        </w:r>
+      </w:hyperlink>
+      <w:r>
+        <w:rPr>
+          <w:rFonts w:ascii="Arial" w:hAnsi="Arial"/>
+          <w:color w:val="000000"/>
+          <w:sz w:val="17"/>
+        </w:rPr>
+        <w:t>	</w:t>
+      </w:r>
+      <w:r>
+        <w:fldChar w:fldCharType="begin" w:dirty="true"/>
+      </w:r>
+      <w:r>
+        <w:instrText xml:space="preserve"> PAGEREF contents_section_026 \h </w:instrText>
+      </w:r>
+      <w:r>
+        <w:fldChar w:fldCharType="separate"/>
+      </w:r>
+      <w:r>
+        <w:rPr>
+          <w:rFonts w:ascii="Arial" w:hAnsi="Arial"/>
+          <w:color w:val="000000"/>
+          <w:sz w:val="17"/>
+        </w:rPr>
+        <w:t/>
+      </w:r>
+      <w:r>
+        <w:fldChar w:fldCharType="end"/>
+      </w:r>
+    </w:p>
+    <w:p>
+      <w:pPr>
+        <w:ind w:left="360" w:firstLine="0"/>
+        <w:tabs>
+          <w:tab w:val="right" w:pos="9000"/>
+        </w:tabs>
+      </w:pPr>
+      <w:hyperlink w:anchor="contents_section_027" w:history="1">
+        <w:r>
+          <w:rPr>
+            <w:rFonts w:ascii="Arial" w:hAnsi="Arial"/>
+            <w:color w:val="000000"/>
+            <w:sz w:val="17"/>
+            <w:u w:val="none"/>
+          </w:rPr>
+          <w:t>7. CHECKOUT PAGE – /checkout</w:t>
+        </w:r>
+      </w:hyperlink>
+      <w:r>
+        <w:rPr>
+          <w:rFonts w:ascii="Arial" w:hAnsi="Arial"/>
+          <w:color w:val="000000"/>
+          <w:sz w:val="17"/>
+        </w:rPr>
+        <w:t>	</w:t>
+      </w:r>
+      <w:r>
+        <w:fldChar w:fldCharType="begin" w:dirty="true"/>
+      </w:r>
+      <w:r>
+        <w:instrText xml:space="preserve"> PAGEREF contents_section_027 \h </w:instrText>
+      </w:r>
+      <w:r>
+        <w:fldChar w:fldCharType="separate"/>
+      </w:r>
+      <w:r>
+        <w:rPr>
+          <w:rFonts w:ascii="Arial" w:hAnsi="Arial"/>
+          <w:color w:val="000000"/>
+          <w:sz w:val="17"/>
+        </w:rPr>
+        <w:t/>
+      </w:r>
+      <w:r>
+        <w:fldChar w:fldCharType="end"/>
+      </w:r>
+    </w:p>
+    <w:p>
+      <w:pPr>
+        <w:ind w:left="360" w:firstLine="0"/>
+        <w:tabs>
+          <w:tab w:val="right" w:pos="9000"/>
+        </w:tabs>
+      </w:pPr>
+      <w:hyperlink w:anchor="contents_section_028" w:history="1">
+        <w:r>
+          <w:rPr>
+            <w:rFonts w:ascii="Arial" w:hAnsi="Arial"/>
+            <w:color w:val="000000"/>
+            <w:sz w:val="17"/>
+            <w:u w:val="none"/>
+          </w:rPr>
+          <w:t>8. ORDER HISTORY PAGE – /orders</w:t>
+        </w:r>
+      </w:hyperlink>
+      <w:r>
+        <w:rPr>
+          <w:rFonts w:ascii="Arial" w:hAnsi="Arial"/>
+          <w:color w:val="000000"/>
+          <w:sz w:val="17"/>
+        </w:rPr>
+        <w:t>	</w:t>
+      </w:r>
+      <w:r>
+        <w:fldChar w:fldCharType="begin" w:dirty="true"/>
+      </w:r>
+      <w:r>
+        <w:instrText xml:space="preserve"> PAGEREF contents_section_028 \h </w:instrText>
+      </w:r>
+      <w:r>
+        <w:fldChar w:fldCharType="separate"/>
+      </w:r>
+      <w:r>
+        <w:rPr>
+          <w:rFonts w:ascii="Arial" w:hAnsi="Arial"/>
+          <w:color w:val="000000"/>
+          <w:sz w:val="17"/>
+        </w:rPr>
+        <w:t/>
+      </w:r>
+      <w:r>
+        <w:fldChar w:fldCharType="end"/>
+      </w:r>
+    </w:p>
+    <w:p>
+      <w:pPr>
+        <w:ind w:left="360" w:firstLine="0"/>
+        <w:tabs>
+          <w:tab w:val="right" w:pos="9000"/>
+        </w:tabs>
+      </w:pPr>
+      <w:hyperlink w:anchor="contents_section_029" w:history="1">
+        <w:r>
+          <w:rPr>
+            <w:rFonts w:ascii="Arial" w:hAnsi="Arial"/>
+            <w:color w:val="000000"/>
+            <w:sz w:val="17"/>
+            <w:u w:val="none"/>
+          </w:rPr>
+          <w:t>9. ORDER REVIEW PAGE – /orders/:orderId/review</w:t>
+        </w:r>
+      </w:hyperlink>
+      <w:r>
+        <w:rPr>
+          <w:rFonts w:ascii="Arial" w:hAnsi="Arial"/>
+          <w:color w:val="000000"/>
+          <w:sz w:val="17"/>
+        </w:rPr>
+        <w:t>	</w:t>
+      </w:r>
+      <w:r>
+        <w:fldChar w:fldCharType="begin" w:dirty="true"/>
+      </w:r>
+      <w:r>
+        <w:instrText xml:space="preserve"> PAGEREF contents_section_029 \h </w:instrText>
+      </w:r>
+      <w:r>
+        <w:fldChar w:fldCharType="separate"/>
+      </w:r>
+      <w:r>
+        <w:rPr>
+          <w:rFonts w:ascii="Arial" w:hAnsi="Arial"/>
+          <w:color w:val="000000"/>
+          <w:sz w:val="17"/>
+        </w:rPr>
+        <w:t/>
+      </w:r>
+      <w:r>
+        <w:fldChar w:fldCharType="end"/>
+      </w:r>
+    </w:p>
+    <w:p>
+      <w:pPr>
+        <w:ind w:left="360" w:firstLine="0"/>
+        <w:tabs>
+          <w:tab w:val="right" w:pos="9000"/>
+        </w:tabs>
+      </w:pPr>
+      <w:hyperlink w:anchor="contents_section_030" w:history="1">
+        <w:r>
+          <w:rPr>
+            <w:rFonts w:ascii="Arial" w:hAnsi="Arial"/>
+            <w:color w:val="000000"/>
+            <w:sz w:val="17"/>
+            <w:u w:val="none"/>
+          </w:rPr>
+          <w:t>10. ROOM STUDIO PAGE – /room-studio</w:t>
+        </w:r>
+      </w:hyperlink>
+      <w:r>
+        <w:rPr>
+          <w:rFonts w:ascii="Arial" w:hAnsi="Arial"/>
+          <w:color w:val="000000"/>
+          <w:sz w:val="17"/>
+        </w:rPr>
+        <w:t>	</w:t>
+      </w:r>
+      <w:r>
+        <w:fldChar w:fldCharType="begin" w:dirty="true"/>
+      </w:r>
+      <w:r>
+        <w:instrText xml:space="preserve"> PAGEREF contents_section_030 \h </w:instrText>
+      </w:r>
+      <w:r>
+        <w:fldChar w:fldCharType="separate"/>
+      </w:r>
+      <w:r>
+        <w:rPr>
+          <w:rFonts w:ascii="Arial" w:hAnsi="Arial"/>
+          <w:color w:val="000000"/>
+          <w:sz w:val="17"/>
+        </w:rPr>
+        <w:t/>
+      </w:r>
+      <w:r>
+        <w:fldChar w:fldCharType="end"/>
+      </w:r>
+    </w:p>
+    <w:p>
+      <w:pPr>
+        <w:ind w:left="360" w:firstLine="0"/>
+        <w:tabs>
+          <w:tab w:val="right" w:pos="9000"/>
+        </w:tabs>
+      </w:pPr>
+      <w:hyperlink w:anchor="contents_section_031" w:history="1">
+        <w:r>
+          <w:rPr>
+            <w:rFonts w:ascii="Arial" w:hAnsi="Arial"/>
+            <w:color w:val="000000"/>
+            <w:sz w:val="17"/>
+            <w:u w:val="none"/>
+          </w:rPr>
+          <w:t>11. PROFILE PAGE – /profile</w:t>
+        </w:r>
+      </w:hyperlink>
+      <w:r>
+        <w:rPr>
+          <w:rFonts w:ascii="Arial" w:hAnsi="Arial"/>
+          <w:color w:val="000000"/>
+          <w:sz w:val="17"/>
+        </w:rPr>
+        <w:t>	</w:t>
+      </w:r>
+      <w:r>
+        <w:fldChar w:fldCharType="begin" w:dirty="true"/>
+      </w:r>
+      <w:r>
+        <w:instrText xml:space="preserve"> PAGEREF contents_section_031 \h </w:instrText>
+      </w:r>
+      <w:r>
+        <w:fldChar w:fldCharType="separate"/>
+      </w:r>
+      <w:r>
+        <w:rPr>
+          <w:rFonts w:ascii="Arial" w:hAnsi="Arial"/>
+          <w:color w:val="000000"/>
+          <w:sz w:val="17"/>
+        </w:rPr>
+        <w:t/>
+      </w:r>
+      <w:r>
+        <w:fldChar w:fldCharType="end"/>
+      </w:r>
+    </w:p>
+    <w:p>
+      <w:pPr>
+        <w:ind w:left="360" w:firstLine="0"/>
+        <w:tabs>
+          <w:tab w:val="right" w:pos="9000"/>
+        </w:tabs>
+      </w:pPr>
+      <w:hyperlink w:anchor="contents_section_032" w:history="1">
+        <w:r>
+          <w:rPr>
+            <w:rFonts w:ascii="Arial" w:hAnsi="Arial"/>
+            <w:color w:val="000000"/>
+            <w:sz w:val="17"/>
+            <w:u w:val="none"/>
+          </w:rPr>
+          <w:t>12. FEEDBACK PAGE – /feedback</w:t>
+        </w:r>
+      </w:hyperlink>
+      <w:r>
+        <w:rPr>
+          <w:rFonts w:ascii="Arial" w:hAnsi="Arial"/>
+          <w:color w:val="000000"/>
+          <w:sz w:val="17"/>
+        </w:rPr>
+        <w:t>	</w:t>
+      </w:r>
+      <w:r>
+        <w:fldChar w:fldCharType="begin" w:dirty="true"/>
+      </w:r>
+      <w:r>
+        <w:instrText xml:space="preserve"> PAGEREF contents_section_032 \h </w:instrText>
+      </w:r>
+      <w:r>
+        <w:fldChar w:fldCharType="separate"/>
+      </w:r>
+      <w:r>
+        <w:rPr>
+          <w:rFonts w:ascii="Arial" w:hAnsi="Arial"/>
+          <w:color w:val="000000"/>
+          <w:sz w:val="17"/>
+        </w:rPr>
+        <w:t/>
+      </w:r>
+      <w:r>
+        <w:fldChar w:fldCharType="end"/>
+      </w:r>
+    </w:p>
+    <w:p>
+      <w:pPr>
+        <w:ind w:left="360" w:firstLine="0"/>
+        <w:tabs>
+          <w:tab w:val="right" w:pos="9000"/>
+        </w:tabs>
+      </w:pPr>
+      <w:hyperlink w:anchor="contents_section_033" w:history="1">
+        <w:r>
+          <w:rPr>
+            <w:rFonts w:ascii="Arial" w:hAnsi="Arial"/>
+            <w:color w:val="000000"/>
+            <w:sz w:val="17"/>
+            <w:u w:val="none"/>
+          </w:rPr>
+          <w:t>13. ADMINISTRATION PAGE – /admin</w:t>
+        </w:r>
+      </w:hyperlink>
+      <w:r>
+        <w:rPr>
+          <w:rFonts w:ascii="Arial" w:hAnsi="Arial"/>
+          <w:color w:val="000000"/>
+          <w:sz w:val="17"/>
+        </w:rPr>
+        <w:t>	</w:t>
+      </w:r>
+      <w:r>
+        <w:fldChar w:fldCharType="begin" w:dirty="true"/>
+      </w:r>
+      <w:r>
+        <w:instrText xml:space="preserve"> PAGEREF contents_section_033 \h </w:instrText>
+      </w:r>
+      <w:r>
+        <w:fldChar w:fldCharType="separate"/>
+      </w:r>
+      <w:r>
+        <w:rPr>
+          <w:rFonts w:ascii="Arial" w:hAnsi="Arial"/>
+          <w:color w:val="000000"/>
+          <w:sz w:val="17"/>
+        </w:rPr>
+        <w:t/>
+      </w:r>
+      <w:r>
+        <w:fldChar w:fldCharType="end"/>
+      </w:r>
+    </w:p>
+    <w:p>
+      <w:pPr>
+        <w:ind w:left="360" w:firstLine="0"/>
+        <w:tabs>
+          <w:tab w:val="right" w:pos="9000"/>
+        </w:tabs>
+      </w:pPr>
+      <w:hyperlink w:anchor="contents_section_034" w:history="1">
+        <w:r>
+          <w:rPr>
+            <w:rFonts w:ascii="Arial" w:hAnsi="Arial"/>
+            <w:color w:val="000000"/>
+            <w:sz w:val="17"/>
+            <w:u w:val="none"/>
+          </w:rPr>
+          <w:t>14. NOT FOUND PAGE – *</w:t>
+        </w:r>
+      </w:hyperlink>
+      <w:r>
+        <w:rPr>
+          <w:rFonts w:ascii="Arial" w:hAnsi="Arial"/>
+          <w:color w:val="000000"/>
+          <w:sz w:val="17"/>
+        </w:rPr>
+        <w:t>	</w:t>
+      </w:r>
+      <w:r>
+        <w:fldChar w:fldCharType="begin" w:dirty="true"/>
+      </w:r>
+      <w:r>
+        <w:instrText xml:space="preserve"> PAGEREF contents_section_034 \h </w:instrText>
+      </w:r>
+      <w:r>
+        <w:fldChar w:fldCharType="separate"/>
+      </w:r>
+      <w:r>
+        <w:rPr>
+          <w:rFonts w:ascii="Arial" w:hAnsi="Arial"/>
+          <w:color w:val="000000"/>
+          <w:sz w:val="17"/>
+        </w:rPr>
+        <w:t/>
+      </w:r>
+      <w:r>
+        <w:fldChar w:fldCharType="end"/>
+      </w:r>
+    </w:p>
+    <w:p>
+      <w:pPr>
+        <w:ind w:left="360" w:firstLine="0"/>
+        <w:tabs>
+          <w:tab w:val="right" w:pos="9000"/>
+        </w:tabs>
+      </w:pPr>
+      <w:hyperlink w:anchor="contents_section_035" w:history="1">
+        <w:r>
+          <w:rPr>
+            <w:rFonts w:ascii="Arial" w:hAnsi="Arial"/>
+            <w:color w:val="000000"/>
+            <w:sz w:val="17"/>
+            <w:u w:val="none"/>
+          </w:rPr>
+          <w:t>15. CROSS-PAGE BUSINESS RULES</w:t>
+        </w:r>
+      </w:hyperlink>
+      <w:r>
+        <w:rPr>
+          <w:rFonts w:ascii="Arial" w:hAnsi="Arial"/>
+          <w:color w:val="000000"/>
+          <w:sz w:val="17"/>
+        </w:rPr>
+        <w:t>	</w:t>
+      </w:r>
+      <w:r>
+        <w:fldChar w:fldCharType="begin" w:dirty="true"/>
+      </w:r>
+      <w:r>
+        <w:instrText xml:space="preserve"> PAGEREF contents_section_035 \h </w:instrText>
+      </w:r>
+      <w:r>
+        <w:fldChar w:fldCharType="separate"/>
+      </w:r>
+      <w:r>
+        <w:rPr>
+          <w:rFonts w:ascii="Arial" w:hAnsi="Arial"/>
+          <w:color w:val="000000"/>
+          <w:sz w:val="17"/>
+        </w:rPr>
+        <w:t/>
+      </w:r>
+      <w:r>
+        <w:fldChar w:fldCharType="end"/>
+      </w:r>
+    </w:p>
+    <w:p>
+      <w:pPr>
+        <w:ind w:left="360" w:firstLine="0"/>
+        <w:tabs>
+          <w:tab w:val="right" w:pos="9000"/>
+        </w:tabs>
+      </w:pPr>
+      <w:hyperlink w:anchor="contents_section_036" w:history="1">
+        <w:r>
+          <w:rPr>
+            <w:rFonts w:ascii="Arial" w:hAnsi="Arial"/>
+            <w:color w:val="000000"/>
+            <w:sz w:val="17"/>
+            <w:u w:val="none"/>
+          </w:rPr>
+          <w:t>16. CONCLUSION</w:t>
+        </w:r>
+      </w:hyperlink>
+      <w:r>
+        <w:rPr>
+          <w:rFonts w:ascii="Arial" w:hAnsi="Arial"/>
+          <w:color w:val="000000"/>
+          <w:sz w:val="17"/>
+        </w:rPr>
+        <w:t>	</w:t>
+      </w:r>
+      <w:r>
+        <w:fldChar w:fldCharType="begin" w:dirty="true"/>
+      </w:r>
+      <w:r>
+        <w:instrText xml:space="preserve"> PAGEREF contents_section_036 \h </w:instrText>
+      </w:r>
+      <w:r>
+        <w:fldChar w:fldCharType="separate"/>
+      </w:r>
+      <w:r>
+        <w:rPr>
+          <w:rFonts w:ascii="Arial" w:hAnsi="Arial"/>
+          <w:color w:val="000000"/>
+          <w:sz w:val="17"/>
+        </w:rPr>
+        <w:t/>
+      </w:r>
+      <w:r>
+        <w:fldChar w:fldCharType="end"/>
+      </w:r>
+    </w:p>
+    <w:p/>
     <w:p>
       <w:r>
         <w:rPr>
@@ -200,6 +1868,7 @@
       <w:pPr>
         <w:pStyle w:val="Heading1"/>
       </w:pPr>
+      <w:bookmarkStart w:id="1" w:name="contents_section_001"/>
       <w:r>
         <w:rPr>
           <w:rFonts w:ascii="Arial" w:hAnsi="Arial"/>
@@ -208,6 +1877,7 @@
         </w:rPr>
         <w:t>REVIEW 1</w:t>
       </w:r>
+      <w:bookmarkEnd w:id="1"/>
     </w:p>
     <w:p>
       <w:r>
@@ -223,6 +1893,7 @@
       <w:pPr>
         <w:pStyle w:val="Heading2"/>
       </w:pPr>
+      <w:bookmarkStart w:id="2" w:name="contents_section_002"/>
       <w:r>
         <w:rPr>
           <w:rFonts w:ascii="Arial" w:hAnsi="Arial"/>
@@ -231,6 +1902,7 @@
         </w:rPr>
         <w:t>1. PROBLEM STATEMENT</w:t>
       </w:r>
+      <w:bookmarkEnd w:id="2"/>
     </w:p>
     <w:p>
       <w:r>
@@ -246,6 +1918,7 @@
       <w:pPr>
         <w:pStyle w:val="Heading2"/>
       </w:pPr>
+      <w:bookmarkStart w:id="3" w:name="contents_section_003"/>
       <w:r>
         <w:rPr>
           <w:rFonts w:ascii="Arial" w:hAnsi="Arial"/>
@@ -254,6 +1927,7 @@
         </w:rPr>
         <w:t>2. PROJECT OBJECTIVES</w:t>
       </w:r>
+      <w:bookmarkEnd w:id="3"/>
     </w:p>
     <w:p>
       <w:pPr>
@@ -350,6 +2024,7 @@
       <w:pPr>
         <w:pStyle w:val="Heading2"/>
       </w:pPr>
+      <w:bookmarkStart w:id="4" w:name="contents_section_004"/>
       <w:r>
         <w:rPr>
           <w:rFonts w:ascii="Arial" w:hAnsi="Arial"/>
@@ -358,6 +2033,7 @@
         </w:rPr>
         <w:t>3. TARGET USERS</w:t>
       </w:r>
+      <w:bookmarkEnd w:id="4"/>
     </w:p>
     <w:tbl>
       <w:tblPr>
@@ -738,6 +2414,7 @@
       <w:pPr>
         <w:pStyle w:val="Heading2"/>
       </w:pPr>
+      <w:bookmarkStart w:id="5" w:name="contents_section_005"/>
       <w:r>
         <w:rPr>
           <w:rFonts w:ascii="Arial" w:hAnsi="Arial"/>
@@ -746,6 +2423,7 @@
         </w:rPr>
         <w:t>4. PROBLEMS ADDRESSED</w:t>
       </w:r>
+      <w:bookmarkEnd w:id="5"/>
     </w:p>
     <w:p>
       <w:pPr>
@@ -816,6 +2494,7 @@
       <w:pPr>
         <w:pStyle w:val="Heading2"/>
       </w:pPr>
+      <w:bookmarkStart w:id="6" w:name="contents_section_006"/>
       <w:r>
         <w:rPr>
           <w:rFonts w:ascii="Arial" w:hAnsi="Arial"/>
@@ -824,6 +2503,7 @@
         </w:rPr>
         <w:t>5. CUSTOMER REQUIREMENTS SPECIFICATION</w:t>
       </w:r>
+      <w:bookmarkEnd w:id="6"/>
     </w:p>
     <w:tbl>
       <w:tblPr>
@@ -1263,6 +2943,7 @@
       <w:pPr>
         <w:pStyle w:val="Heading2"/>
       </w:pPr>
+      <w:bookmarkStart w:id="7" w:name="contents_section_007"/>
       <w:r>
         <w:rPr>
           <w:rFonts w:ascii="Arial" w:hAnsi="Arial"/>
@@ -1271,6 +2952,7 @@
         </w:rPr>
         <w:t>6. GENERAL PROCESS: INPUT → PROCESS → OUTPUT</w:t>
       </w:r>
+      <w:bookmarkEnd w:id="7"/>
     </w:p>
     <w:p>
       <w:pPr>
@@ -1471,6 +3153,7 @@
       <w:pPr>
         <w:pStyle w:val="Heading2"/>
       </w:pPr>
+      <w:bookmarkStart w:id="8" w:name="contents_section_008"/>
       <w:r>
         <w:rPr>
           <w:rFonts w:ascii="Arial" w:hAnsi="Arial"/>
@@ -1479,6 +3162,7 @@
         </w:rPr>
         <w:t>7. CLIENT HARDWARE AND SOFTWARE REQUIREMENTS</w:t>
       </w:r>
+      <w:bookmarkEnd w:id="8"/>
     </w:p>
     <w:tbl>
       <w:tblPr>
@@ -1790,6 +3474,7 @@
       <w:pPr>
         <w:pStyle w:val="Heading2"/>
       </w:pPr>
+      <w:bookmarkStart w:id="9" w:name="contents_section_009"/>
       <w:r>
         <w:rPr>
           <w:rFonts w:ascii="Arial" w:hAnsi="Arial"/>
@@ -1798,6 +3483,7 @@
         </w:rPr>
         <w:t>8. SYSTEM FUNCTION DESCRIPTION</w:t>
       </w:r>
+      <w:bookmarkEnd w:id="9"/>
     </w:p>
     <w:tbl>
       <w:tblPr>
@@ -2355,6 +4041,7 @@
       <w:pPr>
         <w:pStyle w:val="Heading2"/>
       </w:pPr>
+      <w:bookmarkStart w:id="10" w:name="contents_section_010"/>
       <w:r>
         <w:rPr>
           <w:rFonts w:ascii="Arial" w:hAnsi="Arial"/>
@@ -2363,6 +4050,7 @@
         </w:rPr>
         <w:t>9. TASK ASSIGNMENT</w:t>
       </w:r>
+      <w:bookmarkEnd w:id="10"/>
     </w:p>
     <w:tbl>
       <w:tblPr>
@@ -2692,6 +4380,7 @@
       <w:pPr>
         <w:pStyle w:val="Heading1"/>
       </w:pPr>
+      <w:bookmarkStart w:id="11" w:name="contents_section_011"/>
       <w:r>
         <w:rPr>
           <w:rFonts w:ascii="Arial" w:hAnsi="Arial"/>
@@ -2700,6 +4389,7 @@
         </w:rPr>
         <w:t>REVIEW 2</w:t>
       </w:r>
+      <w:bookmarkEnd w:id="11"/>
     </w:p>
     <w:p>
       <w:r>
@@ -2715,6 +4405,7 @@
       <w:pPr>
         <w:pStyle w:val="Heading2"/>
       </w:pPr>
+      <w:bookmarkStart w:id="12" w:name="contents_section_012"/>
       <w:r>
         <w:rPr>
           <w:rFonts w:ascii="Arial" w:hAnsi="Arial"/>
@@ -2723,6 +4414,7 @@
         </w:rPr>
         <w:t>1. FUNCTIONAL REQUIREMENTS: TEXT AND FLOWCHART</w:t>
       </w:r>
+      <w:bookmarkEnd w:id="12"/>
     </w:p>
     <w:p>
       <w:r>
@@ -2794,6 +4486,7 @@
       <w:pPr>
         <w:pStyle w:val="Heading2"/>
       </w:pPr>
+      <w:bookmarkStart w:id="13" w:name="contents_section_013"/>
       <w:r>
         <w:rPr>
           <w:rFonts w:ascii="Arial" w:hAnsi="Arial"/>
@@ -2802,11 +4495,13 @@
         </w:rPr>
         <w:t>2. DATA FLOW DIAGRAM</w:t>
       </w:r>
+      <w:bookmarkEnd w:id="13"/>
     </w:p>
     <w:p>
       <w:pPr>
         <w:pStyle w:val="Heading3"/>
       </w:pPr>
+      <w:bookmarkStart w:id="14" w:name="contents_section_014"/>
       <w:r>
         <w:rPr>
           <w:rFonts w:ascii="Arial" w:hAnsi="Arial"/>
@@ -2815,6 +4510,7 @@
         </w:rPr>
         <w:t>2.1 DFD Level 0 – Context</w:t>
       </w:r>
+      <w:bookmarkEnd w:id="14"/>
     </w:p>
     <w:p>
       <w:r>
@@ -2886,6 +4582,7 @@
       <w:pPr>
         <w:pStyle w:val="Heading3"/>
       </w:pPr>
+      <w:bookmarkStart w:id="15" w:name="contents_section_015"/>
       <w:r>
         <w:rPr>
           <w:rFonts w:ascii="Arial" w:hAnsi="Arial"/>
@@ -2894,6 +4591,7 @@
         </w:rPr>
         <w:t>2.2 DFD Level 1 – Main processes</w:t>
       </w:r>
+      <w:bookmarkEnd w:id="15"/>
     </w:p>
     <w:p>
       <w:pPr>
@@ -2955,6 +4653,7 @@
       <w:pPr>
         <w:pStyle w:val="Heading3"/>
       </w:pPr>
+      <w:bookmarkStart w:id="16" w:name="contents_section_016"/>
       <w:r>
         <w:rPr>
           <w:rFonts w:ascii="Arial" w:hAnsi="Arial"/>
@@ -2963,6 +4662,7 @@
         </w:rPr>
         <w:t>2.3 DFD Level 2 – Orders and reviews</w:t>
       </w:r>
+      <w:bookmarkEnd w:id="16"/>
     </w:p>
     <w:p>
       <w:r>
@@ -3034,6 +4734,7 @@
       <w:pPr>
         <w:pStyle w:val="Heading2"/>
       </w:pPr>
+      <w:bookmarkStart w:id="17" w:name="contents_section_017"/>
       <w:r>
         <w:rPr>
           <w:rFonts w:ascii="Arial" w:hAnsi="Arial"/>
@@ -3042,6 +4743,7 @@
         </w:rPr>
         <w:t>3. FUNCTIONAL DIAGRAM</w:t>
       </w:r>
+      <w:bookmarkEnd w:id="17"/>
     </w:p>
     <w:tbl>
       <w:tblPr>
@@ -3353,6 +5055,7 @@
       <w:pPr>
         <w:pStyle w:val="Heading2"/>
       </w:pPr>
+      <w:bookmarkStart w:id="18" w:name="contents_section_018"/>
       <w:r>
         <w:rPr>
           <w:rFonts w:ascii="Arial" w:hAnsi="Arial"/>
@@ -3361,6 +5064,7 @@
         </w:rPr>
         <w:t>4. DATA STRUCTURE – MONGODB</w:t>
       </w:r>
+      <w:bookmarkEnd w:id="18"/>
     </w:p>
     <w:p>
       <w:r>
@@ -3925,6 +5629,7 @@
       <w:pPr>
         <w:pStyle w:val="Heading2"/>
       </w:pPr>
+      <w:bookmarkStart w:id="19" w:name="contents_section_019"/>
       <w:r>
         <w:rPr>
           <w:rFonts w:ascii="Arial" w:hAnsi="Arial"/>
@@ -3933,6 +5638,7 @@
         </w:rPr>
         <w:t>5. SITE MAP</w:t>
       </w:r>
+      <w:bookmarkEnd w:id="19"/>
     </w:p>
     <w:p>
       <w:pPr>
@@ -4790,6 +6496,7 @@
       <w:pPr>
         <w:pStyle w:val="Heading1"/>
       </w:pPr>
+      <w:bookmarkStart w:id="20" w:name="contents_section_020"/>
       <w:r>
         <w:rPr>
           <w:rFonts w:ascii="Arial" w:hAnsi="Arial"/>
@@ -4798,6 +6505,7 @@
         </w:rPr>
         <w:t>REVIEW 3</w:t>
       </w:r>
+      <w:bookmarkEnd w:id="20"/>
     </w:p>
     <w:p>
       <w:r>
@@ -4813,6 +6521,7 @@
       <w:pPr>
         <w:pStyle w:val="Heading2"/>
       </w:pPr>
+      <w:bookmarkStart w:id="21" w:name="contents_section_021"/>
       <w:r>
         <w:rPr>
           <w:rFonts w:ascii="Arial" w:hAnsi="Arial"/>
@@ -4821,21 +6530,18 @@
         </w:rPr>
         <w:t>1. REVIEW 3 SCOPE</w:t>
       </w:r>
+      <w:bookmarkEnd w:id="21"/>
     </w:p>
     <w:p>
       <w:r>
-        <w:rPr>
-          <w:rFonts w:ascii="Arial" w:hAnsi="Arial"/>
-          <w:b w:val="0"/>
-          <w:color w:val="000000"/>
-        </w:rPr>
-        <w:t>This review records the visible page structure and the implementation path behind each page. Each page includes purpose, interaction, input, validation, output, code path, data source, a representative code excerpt and likely defence questions. Removed concepts such as a Collection page or room-corner marking are not included.</w:t>
+        <w:t>This review records the visible page structure and the implementation path behind each current page. Each page includes purpose, interaction, input, validation, output, code path, data source, a representative code excerpt and likely defence questions.</w:t>
       </w:r>
     </w:p>
     <w:p>
       <w:pPr>
         <w:pStyle w:val="Heading2"/>
       </w:pPr>
+      <w:bookmarkStart w:id="22" w:name="contents_section_022"/>
       <w:r>
         <w:rPr>
           <w:rFonts w:ascii="Arial" w:hAnsi="Arial"/>
@@ -4844,6 +6550,7 @@
         </w:rPr>
         <w:t>2. SHARED LAYOUT AND AUTHENTICATION</w:t>
       </w:r>
+      <w:bookmarkEnd w:id="22"/>
     </w:p>
     <w:p>
       <w:r>
@@ -4863,25 +6570,71 @@
       <w:r>
         <w:rPr>
           <w:rFonts w:ascii="Consolas" w:hAnsi="Consolas"/>
-          <w:b w:val="0"/>
           <w:color w:val="000000"/>
           <w:sz w:val="16"/>
         </w:rPr>
-        <w:t>// client/src/App.jsx</w:t>
-        <w:br/>
-        <w:t>&lt;AuthProvider&gt;</w:t>
-        <w:br/>
-        <w:t xml:space="preserve">  &lt;ProductProvider&gt;</w:t>
-        <w:br/>
-        <w:t xml:space="preserve">    &lt;CartProvider&gt;</w:t>
-        <w:br/>
-        <w:t xml:space="preserve">      &lt;RouterProvider router={router} /&gt;</w:t>
-        <w:br/>
-        <w:t xml:space="preserve">    &lt;/CartProvider&gt;</w:t>
-        <w:br/>
-        <w:t xml:space="preserve">  &lt;/ProductProvider&gt;</w:t>
-        <w:br/>
-        <w:t>&lt;/AuthProvider&gt;</w:t>
+        <w:t>/* client/src/App.jsx */</w:t>
+        <w:br/>
+        <w:t>import { RouterProvider } from 'react-router-dom';</w:t>
+        <w:br/>
+        <w:t>import { AuthProvider } from './context/AuthContext';</w:t>
+        <w:br/>
+        <w:t>import { CartProvider } from './context/CartContext';</w:t>
+        <w:br/>
+        <w:t>import { ProductProvider } from './context/ProductContext';</w:t>
+        <w:br/>
+        <w:t>import router from './router';</w:t>
+        <w:br/>
+        <w:br/>
+        <w:t>export default function App() {</w:t>
+        <w:br/>
+        <w:t xml:space="preserve">  return (</w:t>
+        <w:br/>
+        <w:t xml:space="preserve">    &lt;AuthProvider&gt;</w:t>
+        <w:br/>
+        <w:t xml:space="preserve">      &lt;ProductProvider&gt;</w:t>
+        <w:br/>
+        <w:t xml:space="preserve">        &lt;CartProvider&gt;</w:t>
+        <w:br/>
+        <w:t xml:space="preserve">          &lt;RouterProvider router={router} /&gt;</w:t>
+        <w:br/>
+        <w:t xml:space="preserve">        &lt;/CartProvider&gt;</w:t>
+        <w:br/>
+        <w:t xml:space="preserve">      &lt;/ProductProvider&gt;</w:t>
+        <w:br/>
+        <w:t xml:space="preserve">    &lt;/AuthProvider&gt;</w:t>
+        <w:br/>
+        <w:t xml:space="preserve">  );</w:t>
+        <w:br/>
+        <w:t>}</w:t>
+        <w:br/>
+        <w:br/>
+        <w:t>/* client/src/components/layout/MainLayout.jsx */</w:t>
+        <w:br/>
+        <w:t>const { user } = useAuth();</w:t>
+        <w:br/>
+        <w:t>const isAdmin = user?.role === 'admin' || user?.role === 'superadmin';</w:t>
+        <w:br/>
+        <w:t>return (</w:t>
+        <w:br/>
+        <w:t xml:space="preserve">  &lt;div&gt;</w:t>
+        <w:br/>
+        <w:t xml:space="preserve">    &lt;Header /&gt;</w:t>
+        <w:br/>
+        <w:t xml:space="preserve">    &lt;Outlet /&gt;</w:t>
+        <w:br/>
+        <w:t xml:space="preserve">    {!isAdmin &amp;&amp; &lt;Footer /&gt;}</w:t>
+        <w:br/>
+        <w:t xml:space="preserve">    &lt;LoginModal /&gt;</w:t>
+        <w:br/>
+        <w:t xml:space="preserve">  &lt;/div&gt;</w:t>
+        <w:br/>
+        <w:t>);</w:t>
+        <w:br/>
+        <w:br/>
+        <w:t>/* client/src/router.jsx */</w:t>
+        <w:br/>
+        <w:t>if (user?.role === 'admin' || user?.role === 'superadmin') return &lt;AdminPage /&gt;;</w:t>
       </w:r>
     </w:p>
     <w:p>
@@ -4898,6 +6651,7 @@
       <w:pPr>
         <w:pStyle w:val="Heading2"/>
       </w:pPr>
+      <w:bookmarkStart w:id="23" w:name="contents_section_023"/>
       <w:r>
         <w:rPr>
           <w:rFonts w:ascii="Arial" w:hAnsi="Arial"/>
@@ -4906,6 +6660,7 @@
         </w:rPr>
         <w:t>3. HOME PAGE – /</w:t>
       </w:r>
+      <w:bookmarkEnd w:id="23"/>
     </w:p>
     <w:p>
       <w:pPr>
@@ -5086,15 +6841,8 @@
             <w:vAlign w:val="center"/>
           </w:tcPr>
           <w:p>
-            <w:r/>
-            <w:r>
-              <w:rPr>
-                <w:rFonts w:ascii="Arial" w:hAnsi="Arial"/>
-                <w:b w:val="0"/>
-                <w:color w:val="000000"/>
-                <w:sz w:val="17"/>
-              </w:rPr>
-              <w:t>Hero, featured products and Room Studio call to action.</w:t>
+            <w:r>
+              <w:t>Hero, room slideshow, three guidance cards and links to Products, Cart and Room Studio.</w:t>
             </w:r>
           </w:p>
         </w:tc>
@@ -5127,15 +6875,8 @@
             <w:vAlign w:val="center"/>
           </w:tcPr>
           <w:p>
-            <w:r/>
-            <w:r>
-              <w:rPr>
-                <w:rFonts w:ascii="Arial" w:hAnsi="Arial"/>
-                <w:b w:val="0"/>
-                <w:color w:val="000000"/>
-                <w:sz w:val="17"/>
-              </w:rPr>
-              <w:t>HomePage.jsx → ProductContext → productService.getAll()</w:t>
+            <w:r>
+              <w:t>HomePage.jsx → MainLayout/Header/Footer → React Router links</w:t>
             </w:r>
           </w:p>
         </w:tc>
@@ -5168,15 +6909,8 @@
             <w:vAlign w:val="center"/>
           </w:tcPr>
           <w:p>
-            <w:r/>
-            <w:r>
-              <w:rPr>
-                <w:rFonts w:ascii="Arial" w:hAnsi="Arial"/>
-                <w:b w:val="0"/>
-                <w:color w:val="000000"/>
-                <w:sz w:val="17"/>
-              </w:rPr>
-              <w:t>No private input; inactive or invalid products are not displayed.</w:t>
+            <w:r>
+              <w:t>There is no private input; the visitor follows links to the catalogue, cart or Room Studio.</w:t>
             </w:r>
           </w:p>
         </w:tc>
@@ -5209,15 +6943,8 @@
             <w:vAlign w:val="center"/>
           </w:tcPr>
           <w:p>
-            <w:r/>
-            <w:r>
-              <w:rPr>
-                <w:rFonts w:ascii="Arial" w:hAnsi="Arial"/>
-                <w:b w:val="0"/>
-                <w:color w:val="000000"/>
-                <w:sz w:val="17"/>
-              </w:rPr>
-              <w:t>Home content and product cards.</w:t>
+            <w:r>
+              <w:t>Hero, slideshow, three-step guidance and navigation buttons.</w:t>
             </w:r>
           </w:p>
         </w:tc>
@@ -5291,15 +7018,8 @@
             <w:vAlign w:val="center"/>
           </w:tcPr>
           <w:p>
-            <w:r/>
-            <w:r>
-              <w:rPr>
-                <w:rFonts w:ascii="Arial" w:hAnsi="Arial"/>
-                <w:b w:val="0"/>
-                <w:color w:val="000000"/>
-                <w:sz w:val="17"/>
-              </w:rPr>
-              <w:t>Why separate HomePage? It composes reusable components without owning server rules.</w:t>
+            <w:r>
+              <w:t>Why keep HomePage light? The catalogue is loaded on its own page, so the entry page remains quick and easy to explain.</w:t>
             </w:r>
           </w:p>
         </w:tc>
@@ -5328,19 +7048,91 @@
       <w:r>
         <w:rPr>
           <w:rFonts w:ascii="Consolas" w:hAnsi="Consolas"/>
-          <w:b w:val="0"/>
           <w:color w:val="000000"/>
           <w:sz w:val="16"/>
         </w:rPr>
-        <w:t>const { products } = useProducts();</w:t>
-        <w:br/>
-        <w:t>return &lt;ProductGrid products={products.slice(0, 8)} /&gt;;</w:t>
+        <w:t>/* client/src/pages/HomePage.jsx */</w:t>
+        <w:br/>
+        <w:t>export default function HomePage() {</w:t>
+        <w:br/>
+        <w:t xml:space="preserve">  return (</w:t>
+        <w:br/>
+        <w:t xml:space="preserve">    &lt;main className="fh-home"&gt;</w:t>
+        <w:br/>
+        <w:t xml:space="preserve">      &lt;section className="fh-hero"&gt;</w:t>
+        <w:br/>
+        <w:t xml:space="preserve">        &lt;div className="container fh-hero-grid"&gt;</w:t>
+        <w:br/>
+        <w:t xml:space="preserve">          &lt;div className="fh-hero-copy"&gt;</w:t>
+        <w:br/>
+        <w:t xml:space="preserve">            &lt;p className="eyebrow"&gt;NỘI THẤT CHO KHÔNG GIAN SỐNG&lt;/p&gt;</w:t>
+        <w:br/>
+        <w:t xml:space="preserve">            &lt;h1&gt;Chọn đúng sản phẩm cho căn phòng của bạn.&lt;/h1&gt;</w:t>
+        <w:br/>
+        <w:t xml:space="preserve">            &lt;p&gt;Tìm sản phẩm, đặt hàng và thử trực tiếp trên ảnh phòng.&lt;/p&gt;</w:t>
+        <w:br/>
+        <w:t xml:space="preserve">            &lt;div className="hero-actions"&gt;</w:t>
+        <w:br/>
+        <w:t xml:space="preserve">              &lt;Link className="button" to="/products"&gt;Xem sản phẩm&lt;/Link&gt;</w:t>
+        <w:br/>
+        <w:t xml:space="preserve">              &lt;Link className="button button-secondary" to="/room-studio"&gt;Mở Phòng thử&lt;/Link&gt;</w:t>
+        <w:br/>
+        <w:t xml:space="preserve">            &lt;/div&gt;</w:t>
+        <w:br/>
+        <w:t xml:space="preserve">          &lt;/div&gt;</w:t>
+        <w:br/>
+        <w:t xml:space="preserve">          &lt;div className="fh-room-story" aria-label="Ảnh phòng và các phương án nội thất"&gt;</w:t>
+        <w:br/>
+        <w:t xml:space="preserve">            &lt;div className="fh-room-slideshow" role="group" aria-label="Slideshow ảnh phòng"&gt;</w:t>
+        <w:br/>
+        <w:t xml:space="preserve">              &lt;figure className="fh-room-slide"&gt;</w:t>
+        <w:br/>
+        <w:t xml:space="preserve">                &lt;img src="/images/home-room-1.webp" alt="Phòng trọ có gác lửng và sàn gạch" /&gt;</w:t>
+        <w:br/>
+        <w:t xml:space="preserve">              &lt;/figure&gt;</w:t>
+        <w:br/>
+        <w:t xml:space="preserve">              &lt;figure className="fh-room-slide" aria-hidden="true"&gt;</w:t>
+        <w:br/>
+        <w:t xml:space="preserve">                &lt;img src="/images/home-room-2.webp" alt="Phòng trọ sau khi thử một bàn thấp" /&gt;</w:t>
+        <w:br/>
+        <w:t xml:space="preserve">              &lt;/figure&gt;</w:t>
+        <w:br/>
+        <w:t xml:space="preserve">            &lt;/div&gt;</w:t>
+        <w:br/>
+        <w:t xml:space="preserve">          &lt;/div&gt;</w:t>
+        <w:br/>
+        <w:t xml:space="preserve">        &lt;/div&gt;</w:t>
+        <w:br/>
+        <w:t xml:space="preserve">      &lt;/section&gt;</w:t>
+        <w:br/>
+        <w:t xml:space="preserve">      &lt;section className="container fh-start-section"&gt;</w:t>
+        <w:br/>
+        <w:t xml:space="preserve">        &lt;h2&gt;Từ lựa chọn đến căn phòng của bạn&lt;/h2&gt;</w:t>
+        <w:br/>
+        <w:t xml:space="preserve">        &lt;div className="fh-step-grid"&gt;</w:t>
+        <w:br/>
+        <w:t xml:space="preserve">          &lt;article&gt;&lt;span&gt;01&lt;/span&gt;&lt;h3&gt;Chọn sản phẩm&lt;/h3&gt;&lt;Link to="/products"&gt;Đến danh sách sản phẩm →&lt;/Link&gt;&lt;/article&gt;</w:t>
+        <w:br/>
+        <w:t xml:space="preserve">          &lt;article&gt;&lt;span&gt;02&lt;/span&gt;&lt;h3&gt;Đặt hàng&lt;/h3&gt;&lt;Link to="/cart"&gt;Mở giỏ hàng →&lt;/Link&gt;&lt;/article&gt;</w:t>
+        <w:br/>
+        <w:t xml:space="preserve">          &lt;article&gt;&lt;span&gt;03&lt;/span&gt;&lt;h3&gt;Thử trong phòng&lt;/h3&gt;&lt;Link to="/room-studio"&gt;Mở Phòng thử →&lt;/Link&gt;&lt;/article&gt;</w:t>
+        <w:br/>
+        <w:t xml:space="preserve">        &lt;/div&gt;</w:t>
+        <w:br/>
+        <w:t xml:space="preserve">      &lt;/section&gt;</w:t>
+        <w:br/>
+        <w:t xml:space="preserve">    &lt;/main&gt;</w:t>
+        <w:br/>
+        <w:t xml:space="preserve">  );</w:t>
+        <w:br/>
+        <w:t>}</w:t>
       </w:r>
     </w:p>
     <w:p>
       <w:pPr>
         <w:pStyle w:val="Heading2"/>
       </w:pPr>
+      <w:bookmarkStart w:id="24" w:name="contents_section_024"/>
       <w:r>
         <w:rPr>
           <w:rFonts w:ascii="Arial" w:hAnsi="Arial"/>
@@ -5349,6 +7141,7 @@
         </w:rPr>
         <w:t>4. PRODUCT LIST PAGE – /products</w:t>
       </w:r>
+      <w:bookmarkEnd w:id="24"/>
     </w:p>
     <w:p>
       <w:pPr>
@@ -5570,15 +7363,8 @@
             <w:vAlign w:val="center"/>
           </w:tcPr>
           <w:p>
-            <w:r/>
-            <w:r>
-              <w:rPr>
-                <w:rFonts w:ascii="Arial" w:hAnsi="Arial"/>
-                <w:b w:val="0"/>
-                <w:color w:val="000000"/>
-                <w:sz w:val="17"/>
-              </w:rPr>
-              <w:t>ProductListPage.jsx → ProductContext → productService.getPage() → GET /api/products</w:t>
+            <w:r>
+              <w:t>ProductListPage.jsx → productService.getPage() → GET /api/products; JSON snapshot is used only for the first quick display.</w:t>
             </w:r>
           </w:p>
         </w:tc>
@@ -5611,15 +7397,8 @@
             <w:vAlign w:val="center"/>
           </w:tcPr>
           <w:p>
-            <w:r/>
-            <w:r>
-              <w:rPr>
-                <w:rFonts w:ascii="Arial" w:hAnsi="Arial"/>
-                <w:b w:val="0"/>
-                <w:color w:val="000000"/>
-                <w:sz w:val="17"/>
-              </w:rPr>
-              <w:t>Search and page values are normalized; the server escapes the search expression.</w:t>
+            <w:r>
+              <w:t>Search, page, category and sort values are sent to the API; the server escapes search text and limits page size.</w:t>
             </w:r>
           </w:p>
         </w:tc>
@@ -5771,19 +7550,95 @@
       <w:r>
         <w:rPr>
           <w:rFonts w:ascii="Consolas" w:hAnsi="Consolas"/>
-          <w:b w:val="0"/>
           <w:color w:val="000000"/>
           <w:sz w:val="16"/>
         </w:rPr>
-        <w:t>const result = await productService.getPage({ page, limit, search, sort, category });</w:t>
-        <w:br/>
-        <w:t>setProducts(result.products);</w:t>
+        <w:t>/* client/src/pages/ProductListPage.jsx */</w:t>
+        <w:br/>
+        <w:t>const params = { page, limit: 12 };</w:t>
+        <w:br/>
+        <w:t>if (keyword) params.search = keyword;</w:t>
+        <w:br/>
+        <w:t>if (category !== 'Tất cả') params.category = category;</w:t>
+        <w:br/>
+        <w:t>if (sort !== 'default') params.sort = sort;</w:t>
+        <w:br/>
+        <w:br/>
+        <w:t>let snapshotShown = false;</w:t>
+        <w:br/>
+        <w:t>if (page === 1 &amp;&amp; !keyword &amp;&amp; category === 'Tất cả' &amp;&amp; sort === 'default') {</w:t>
+        <w:br/>
+        <w:t xml:space="preserve">  try {</w:t>
+        <w:br/>
+        <w:t xml:space="preserve">    const response = await fetch('/data_import/data_import.json');</w:t>
+        <w:br/>
+        <w:t xml:space="preserve">    const snapshot = await response.json();</w:t>
+        <w:br/>
+        <w:t xml:space="preserve">    if (active &amp;&amp; Array.isArray(snapshot)) {</w:t>
+        <w:br/>
+        <w:t xml:space="preserve">      const visible = snapshot.filter((item) =&gt; item.isActive !== false &amp;&amp; Number(item.price) &gt; 0);</w:t>
+        <w:br/>
+        <w:t xml:space="preserve">      setProducts(visible.slice(0, 12));</w:t>
+        <w:br/>
+        <w:t xml:space="preserve">      setPagination({ total: visible.length, page: 1,</w:t>
+        <w:br/>
+        <w:t xml:space="preserve">        totalPages: Math.max(1, Math.ceil(visible.length / 12)) });</w:t>
+        <w:br/>
+        <w:t xml:space="preserve">      snapshotShown = true;</w:t>
+        <w:br/>
+        <w:t xml:space="preserve">    }</w:t>
+        <w:br/>
+        <w:t xml:space="preserve">  } catch {}</w:t>
+        <w:br/>
+        <w:t>}</w:t>
+        <w:br/>
+        <w:br/>
+        <w:t>try {</w:t>
+        <w:br/>
+        <w:t xml:space="preserve">  const result = await productService.getPage(params);</w:t>
+        <w:br/>
+        <w:t xml:space="preserve">  if (!active) return;</w:t>
+        <w:br/>
+        <w:t xml:space="preserve">  setProducts(result.products);</w:t>
+        <w:br/>
+        <w:t xml:space="preserve">  setPagination(result.pagination);</w:t>
+        <w:br/>
+        <w:t>} catch {</w:t>
+        <w:br/>
+        <w:t xml:space="preserve">  if (active &amp;&amp; !snapshotShown) setProducts([]);</w:t>
+        <w:br/>
+        <w:t>}</w:t>
+        <w:br/>
+        <w:br/>
+        <w:t>/* client/src/services/productService.js */</w:t>
+        <w:br/>
+        <w:t>async getPage(params = {}) {</w:t>
+        <w:br/>
+        <w:t xml:space="preserve">  const response = await apiClient.get('/products', { params });</w:t>
+        <w:br/>
+        <w:t xml:space="preserve">  return {</w:t>
+        <w:br/>
+        <w:t xml:space="preserve">    products: Array.isArray(response.data.data) ? response.data.data : [],</w:t>
+        <w:br/>
+        <w:t xml:space="preserve">    pagination: response.data.pagination || null,</w:t>
+        <w:br/>
+        <w:t xml:space="preserve">    categories: Array.isArray(response.data.categories) ? response.data.categories : [],</w:t>
+        <w:br/>
+        <w:t xml:space="preserve">  };</w:t>
+        <w:br/>
+        <w:t>}</w:t>
+        <w:br/>
+        <w:br/>
+        <w:t>/* server/src/routes/productRoutes.js */</w:t>
+        <w:br/>
+        <w:t>router.get('/', optionalAuthenticate, productController.list);</w:t>
       </w:r>
     </w:p>
     <w:p>
       <w:pPr>
         <w:pStyle w:val="Heading2"/>
       </w:pPr>
+      <w:bookmarkStart w:id="25" w:name="contents_section_025"/>
       <w:r>
         <w:rPr>
           <w:rFonts w:ascii="Arial" w:hAnsi="Arial"/>
@@ -5792,6 +7647,7 @@
         </w:rPr>
         <w:t>5. PRODUCT DETAIL PAGE – /products/:id</w:t>
       </w:r>
+      <w:bookmarkEnd w:id="25"/>
     </w:p>
     <w:p>
       <w:pPr>
@@ -6214,23 +8070,112 @@
       <w:r>
         <w:rPr>
           <w:rFonts w:ascii="Consolas" w:hAnsi="Consolas"/>
-          <w:b w:val="0"/>
           <w:color w:val="000000"/>
           <w:sz w:val="16"/>
         </w:rPr>
-        <w:t>const addToCart = async () =&gt; {</w:t>
-        <w:br/>
-        <w:t xml:space="preserve">  if (!user) return openLogin("login");</w:t>
-        <w:br/>
-        <w:t xml:space="preserve">  await addItem(product, quantity);</w:t>
+        <w:t>/* client/src/pages/ProductDetailPage.jsx */</w:t>
+        <w:br/>
+        <w:t>useEffect(() =&gt; {</w:t>
+        <w:br/>
+        <w:t xml:space="preserve">  let active = true;</w:t>
+        <w:br/>
+        <w:t xml:space="preserve">  setLoading(true);</w:t>
+        <w:br/>
+        <w:t xml:space="preserve">  productService.getById(id)</w:t>
+        <w:br/>
+        <w:t xml:space="preserve">    .then((data) =&gt; { if (active) setProduct(data); })</w:t>
+        <w:br/>
+        <w:t xml:space="preserve">    .catch(() =&gt; { if (active) setProduct(null); })</w:t>
+        <w:br/>
+        <w:t xml:space="preserve">    .finally(() =&gt; { if (active) setLoading(false); });</w:t>
+        <w:br/>
+        <w:t xml:space="preserve">  return () =&gt; { active = false; };</w:t>
+        <w:br/>
+        <w:t>}, [id]);</w:t>
+        <w:br/>
+        <w:br/>
+        <w:t>const loadReviews = async () =&gt; {</w:t>
+        <w:br/>
+        <w:t xml:space="preserve">  if (!productId) return;</w:t>
+        <w:br/>
+        <w:t xml:space="preserve">  setReviewsLoading(true);</w:t>
+        <w:br/>
+        <w:t xml:space="preserve">  try { setReviews(await reviewService.getReviews(productId)); }</w:t>
+        <w:br/>
+        <w:t xml:space="preserve">  catch { setReviews([]); }</w:t>
+        <w:br/>
+        <w:t xml:space="preserve">  finally { setReviewsLoading(false); }</w:t>
         <w:br/>
         <w:t>};</w:t>
+        <w:br/>
+        <w:br/>
+        <w:t>const stock = Math.max(0, Number(product.stock ?? product.countInStock ?? 99));</w:t>
+        <w:br/>
+        <w:t>const maxPurchaseQuantity = Math.min(stock, 100);</w:t>
+        <w:br/>
+        <w:t>const add = () =&gt; {</w:t>
+        <w:br/>
+        <w:t xml:space="preserve">  const outcome = addToCart(product, quantity);</w:t>
+        <w:br/>
+        <w:t xml:space="preserve">  setNotice(outcome?.ok === false ? outcome.message : 'Đã thêm vào giỏ hàng.');</w:t>
+        <w:br/>
+        <w:t>};</w:t>
+        <w:br/>
+        <w:t>const buyNow = () =&gt; {</w:t>
+        <w:br/>
+        <w:t xml:space="preserve">  if (!user) {</w:t>
+        <w:br/>
+        <w:t xml:space="preserve">    openLogin('login');</w:t>
+        <w:br/>
+        <w:t xml:space="preserve">    return;</w:t>
+        <w:br/>
+        <w:t xml:space="preserve">  }</w:t>
+        <w:br/>
+        <w:t xml:space="preserve">  navigate('/checkout', {</w:t>
+        <w:br/>
+        <w:t xml:space="preserve">    state: {</w:t>
+        <w:br/>
+        <w:t xml:space="preserve">      buyNowItem: {</w:t>
+        <w:br/>
+        <w:t xml:space="preserve">        product,</w:t>
+        <w:br/>
+        <w:t xml:space="preserve">        quantity,</w:t>
+        <w:br/>
+        <w:t xml:space="preserve">        price: Number(product.price) || 0,</w:t>
+        <w:br/>
+        <w:t xml:space="preserve">        name: product.name,</w:t>
+        <w:br/>
+        <w:t xml:space="preserve">        image: product.image || product.transparentImage || product.sourceImages?.[0] || '',</w:t>
+        <w:br/>
+        <w:t xml:space="preserve">      },</w:t>
+        <w:br/>
+        <w:t xml:space="preserve">    },</w:t>
+        <w:br/>
+        <w:t xml:space="preserve">  });</w:t>
+        <w:br/>
+        <w:t>};</w:t>
+        <w:br/>
+        <w:br/>
+        <w:t>/* client/src/services/productService.js */</w:t>
+        <w:br/>
+        <w:t>async getById(id) {</w:t>
+        <w:br/>
+        <w:t xml:space="preserve">  const response = await apiClient.get(`/products/${id}`);</w:t>
+        <w:br/>
+        <w:t xml:space="preserve">  return response.data.data;</w:t>
+        <w:br/>
+        <w:t>}</w:t>
+        <w:br/>
+        <w:t>/* server/src/routes/productRoutes.js */</w:t>
+        <w:br/>
+        <w:t>router.get('/:id', optionalAuthenticate, productController.getById);</w:t>
       </w:r>
     </w:p>
     <w:p>
       <w:pPr>
         <w:pStyle w:val="Heading2"/>
       </w:pPr>
+      <w:bookmarkStart w:id="26" w:name="contents_section_026"/>
       <w:r>
         <w:rPr>
           <w:rFonts w:ascii="Arial" w:hAnsi="Arial"/>
@@ -6239,6 +8184,7 @@
         </w:rPr>
         <w:t>6. CART PAGE – /cart</w:t>
       </w:r>
+      <w:bookmarkEnd w:id="26"/>
     </w:p>
     <w:p>
       <w:pPr>
@@ -6661,19 +8607,111 @@
       <w:r>
         <w:rPr>
           <w:rFonts w:ascii="Consolas" w:hAnsi="Consolas"/>
-          <w:b w:val="0"/>
           <w:color w:val="000000"/>
           <w:sz w:val="16"/>
         </w:rPr>
+        <w:t>/* client/src/context/CartContext.jsx */</w:t>
+        <w:br/>
+        <w:t>const userId = user?._id || user?.id || null;</w:t>
+        <w:br/>
+        <w:t>const [items, setItems] = useState(() =&gt; normalizeSelection(getStoredCart(userId)));</w:t>
+        <w:br/>
+        <w:br/>
+        <w:t>useEffect(() =&gt; {</w:t>
+        <w:br/>
+        <w:t xml:space="preserve">  if (!userId) return;</w:t>
+        <w:br/>
+        <w:t xml:space="preserve">  const guestItems = pendingGuestSyncRef.current;</w:t>
+        <w:br/>
+        <w:t xml:space="preserve">  pendingGuestSyncRef.current = [];</w:t>
+        <w:br/>
+        <w:t xml:space="preserve">  (async () =&gt; {</w:t>
+        <w:br/>
+        <w:t xml:space="preserve">    try {</w:t>
+        <w:br/>
+        <w:t xml:space="preserve">      const cart = guestItems.length</w:t>
+        <w:br/>
+        <w:t xml:space="preserve">        ? await cartService.sync(guestItems.map((item) =&gt; ({</w:t>
+        <w:br/>
+        <w:t xml:space="preserve">          productId: productId(item.product), quantity: item.quantity,</w:t>
+        <w:br/>
+        <w:t xml:space="preserve">        })))</w:t>
+        <w:br/>
+        <w:t xml:space="preserve">        : await cartService.get();</w:t>
+        <w:br/>
+        <w:t xml:space="preserve">      setItems(normalizeSelection(fromRemote(cart)));</w:t>
+        <w:br/>
+        <w:t xml:space="preserve">    } catch { /* vẫn giữ giỏ cục bộ */ }</w:t>
+        <w:br/>
+        <w:t xml:space="preserve">  })();</w:t>
+        <w:br/>
+        <w:t>}, [userId]);</w:t>
+        <w:br/>
+        <w:br/>
         <w:t>const selectedItems = items.filter((item) =&gt; item.selected !== false);</w:t>
         <w:br/>
-        <w:t>const subtotal = selectedItems.reduce((sum, item) =&gt; sum + item.price * item.quantity, 0);</w:t>
+        <w:t>const selectedCount = selectedItems.reduce((sum, item) =&gt; sum + item.quantity, 0);</w:t>
+        <w:br/>
+        <w:t>const selectedSubtotal = selectedItems.reduce((sum, item) =&gt; sum + item.price * item.quantity, 0);</w:t>
+        <w:br/>
+        <w:br/>
+        <w:t>addToCart(product, quantity = 1) {</w:t>
+        <w:br/>
+        <w:t xml:space="preserve">  const id = productId(product);</w:t>
+        <w:br/>
+        <w:t xml:space="preserve">  const stock = stockOf(product);</w:t>
+        <w:br/>
+        <w:t xml:space="preserve">  if (!id || stock &lt; 1) return { ok: false, message: 'Sản phẩm hiện đã hết hàng.' };</w:t>
+        <w:br/>
+        <w:t xml:space="preserve">  const qty = Math.min(stock, Math.max(1, Number(quantity) || 1));</w:t>
+        <w:br/>
+        <w:t xml:space="preserve">  setItems((current) =&gt; {</w:t>
+        <w:br/>
+        <w:t xml:space="preserve">    const existing = current.find((item) =&gt; productId(item.product) === id);</w:t>
+        <w:br/>
+        <w:t xml:space="preserve">    const selectedCount = current.reduce((sum, item) =&gt; sum + (item.selected !== false ? item.quantity : 0), 0);</w:t>
+        <w:br/>
+        <w:t xml:space="preserve">    if (!existing) {</w:t>
+        <w:br/>
+        <w:t xml:space="preserve">      return [...current, { product, quantity: qty, price: Number(product.price) || 0,</w:t>
+        <w:br/>
+        <w:t xml:space="preserve">        name: product.name, image: product.image || product.transparentImage || '',</w:t>
+        <w:br/>
+        <w:t xml:space="preserve">        selected: selectedCount + qty &lt;= MAX_SELECTED_COUNT }];</w:t>
+        <w:br/>
+        <w:t xml:space="preserve">    }</w:t>
+        <w:br/>
+        <w:t xml:space="preserve">    const nextQuantity = Math.min(stock, existing.quantity + qty);</w:t>
+        <w:br/>
+        <w:t xml:space="preserve">    return current.map((item) =&gt; productId(item.product) === id</w:t>
+        <w:br/>
+        <w:t xml:space="preserve">      ? { ...item, product, quantity: nextQuantity, price: Number(product.price) || 0 }</w:t>
+        <w:br/>
+        <w:t xml:space="preserve">      : item);</w:t>
+        <w:br/>
+        <w:t xml:space="preserve">  });</w:t>
+        <w:br/>
+        <w:t xml:space="preserve">  if (userId) cartService.add(id, qty).catch(() =&gt; {});</w:t>
+        <w:br/>
+        <w:t xml:space="preserve">  return { ok: true };</w:t>
+        <w:br/>
+        <w:t>}</w:t>
+        <w:br/>
+        <w:br/>
+        <w:t>/* server/src/routes/cartRoutes.js */</w:t>
+        <w:br/>
+        <w:t>router.use(authenticate);</w:t>
+        <w:br/>
+        <w:t>router.post('/sync', cartController.syncCart);</w:t>
+        <w:br/>
+        <w:t>router.post('/add', cartController.addToCart);</w:t>
       </w:r>
     </w:p>
     <w:p>
       <w:pPr>
         <w:pStyle w:val="Heading2"/>
       </w:pPr>
+      <w:bookmarkStart w:id="27" w:name="contents_section_027"/>
       <w:r>
         <w:rPr>
           <w:rFonts w:ascii="Arial" w:hAnsi="Arial"/>
@@ -6682,6 +8720,7 @@
         </w:rPr>
         <w:t>7. CHECKOUT PAGE – /checkout</w:t>
       </w:r>
+      <w:bookmarkEnd w:id="27"/>
     </w:p>
     <w:p>
       <w:pPr>
@@ -7104,19 +9143,96 @@
       <w:r>
         <w:rPr>
           <w:rFonts w:ascii="Consolas" w:hAnsi="Consolas"/>
-          <w:b w:val="0"/>
           <w:color w:val="000000"/>
           <w:sz w:val="16"/>
         </w:rPr>
-        <w:t>const result = await orderService.createOrder({ items, shippingAddress, paymentMethod, voucherCode });</w:t>
-        <w:br/>
-        <w:t>setOrder(result);</w:t>
+        <w:t>/* client/src/pages/CheckoutPage.jsx */</w:t>
+        <w:br/>
+        <w:t>function hasCompleteDeliveryProfile(user) {</w:t>
+        <w:br/>
+        <w:t xml:space="preserve">  return Boolean(user?.name?.trim() &amp;&amp; user?.phone &amp;&amp; user?.address?.trim()</w:t>
+        <w:br/>
+        <w:t xml:space="preserve">    &amp;&amp; user?.provinceCode &amp;&amp; user?.districtCode &amp;&amp; user?.wardCode);</w:t>
+        <w:br/>
+        <w:t>}</w:t>
+        <w:br/>
+        <w:br/>
+        <w:t>const items = buyNowItem ? [buyNowItem]</w:t>
+        <w:br/>
+        <w:t xml:space="preserve">  : (selectedItems.length &gt; 0 ? selectedItems : allCartItems);</w:t>
+        <w:br/>
+        <w:t>const shippingInfo = calculateShippingFee(user.provinceCode);</w:t>
+        <w:br/>
+        <w:t>const shippingFee = shippingInfo.fee - shippingDiscount;</w:t>
+        <w:br/>
+        <w:t>const totalAmount = rawSubtotal + shippingFee;</w:t>
+        <w:br/>
+        <w:br/>
+        <w:t>const submit = async (event) =&gt; {</w:t>
+        <w:br/>
+        <w:t xml:space="preserve">  event.preventDefault();</w:t>
+        <w:br/>
+        <w:t xml:space="preserve">  const phoneCheck = validateVietnamPhone(user.phone);</w:t>
+        <w:br/>
+        <w:t xml:space="preserve">  const addressCheck = validateSpecificAddress(user.address);</w:t>
+        <w:br/>
+        <w:t xml:space="preserve">  if (!phoneCheck.isValid) return setError(phoneCheck.message);</w:t>
+        <w:br/>
+        <w:t xml:space="preserve">  if (!addressCheck.isValid) return setError(addressCheck.message);</w:t>
+        <w:br/>
+        <w:t xml:space="preserve">  const fullAddress = [addressCheck.address, user.wardName,</w:t>
+        <w:br/>
+        <w:t xml:space="preserve">    user.districtName, provinceName(user.provinceCode)].filter(Boolean).join(', ');</w:t>
+        <w:br/>
+        <w:t xml:space="preserve">  setSaving(true);</w:t>
+        <w:br/>
+        <w:t xml:space="preserve">  try {</w:t>
+        <w:br/>
+        <w:t xml:space="preserve">    const order = await orderService.createOrder({</w:t>
+        <w:br/>
+        <w:t xml:space="preserve">      items: items.map((item) =&gt; ({ productId: item.product._id || item.product.id, quantity: item.quantity })),</w:t>
+        <w:br/>
+        <w:t xml:space="preserve">      shippingAddress: { fullName: user.name.trim(), phone: user.phone.trim(),</w:t>
+        <w:br/>
+        <w:t xml:space="preserve">        address: fullAddress, provinceCode: user.provinceCode, note: user.deliveryNote.trim() },</w:t>
+        <w:br/>
+        <w:t xml:space="preserve">      paymentMethod,</w:t>
+        <w:br/>
+        <w:t xml:space="preserve">    });</w:t>
+        <w:br/>
+        <w:t xml:space="preserve">    if (!buyNowItem) clearPurchasedItems(items.map((item) =&gt; item.product._id || item.product.id));</w:t>
+        <w:br/>
+        <w:t xml:space="preserve">    setResult(order);</w:t>
+        <w:br/>
+        <w:t xml:space="preserve">  } catch (error) { setError(error.response?.data?.message || error.message); }</w:t>
+        <w:br/>
+        <w:t xml:space="preserve">  finally { setSaving(false); }</w:t>
+        <w:br/>
+        <w:t>};</w:t>
+        <w:br/>
+        <w:br/>
+        <w:t>/* server/src/controllers/orderController.js */</w:t>
+        <w:br/>
+        <w:t>const baseShippingFee = calculateShippingFee(address.provinceCode);</w:t>
+        <w:br/>
+        <w:t>const product = await Product.findOneAndUpdate(</w:t>
+        <w:br/>
+        <w:t xml:space="preserve">  { _id: item.productId, isActive: true, price: { $gt: 0 }, stock: { $gte: item.qty } },</w:t>
+        <w:br/>
+        <w:t xml:space="preserve">  { $inc: { stock: -item.qty } }, { returnDocument: 'after' },</w:t>
+        <w:br/>
+        <w:t>);</w:t>
+        <w:br/>
+        <w:t>const order = await Order.create({ orderItems, subtotal, shippingFee,</w:t>
+        <w:br/>
+        <w:t xml:space="preserve">  totalAmount: subtotal + shippingFee, paymentStatus: 'Pending', orderStatus: 'Pending' });</w:t>
       </w:r>
     </w:p>
     <w:p>
       <w:pPr>
         <w:pStyle w:val="Heading2"/>
       </w:pPr>
+      <w:bookmarkStart w:id="28" w:name="contents_section_028"/>
       <w:r>
         <w:rPr>
           <w:rFonts w:ascii="Arial" w:hAnsi="Arial"/>
@@ -7125,6 +9241,7 @@
         </w:rPr>
         <w:t>8. ORDER HISTORY PAGE – /orders</w:t>
       </w:r>
+      <w:bookmarkEnd w:id="28"/>
     </w:p>
     <w:p>
       <w:pPr>
@@ -7547,19 +9664,80 @@
       <w:r>
         <w:rPr>
           <w:rFonts w:ascii="Consolas" w:hAnsi="Consolas"/>
-          <w:b w:val="0"/>
           <w:color w:val="000000"/>
           <w:sz w:val="16"/>
         </w:rPr>
-        <w:t>const canCancel = ["Pending", "Processing"].includes(order.orderStatus);</w:t>
-        <w:br/>
-        <w:t>return canCancel ? &lt;button&gt;Hủy đơn&lt;/button&gt; : null;</w:t>
+        <w:t>/* client/src/pages/OrderHistoryPage.jsx */</w:t>
+        <w:br/>
+        <w:t>const statusLabel = {</w:t>
+        <w:br/>
+        <w:t xml:space="preserve">  Pending: 'Chờ xác nhận', Processing: 'Đang xử lý', Shipped: 'Đang giao',</w:t>
+        <w:br/>
+        <w:t xml:space="preserve">  Delivered: 'Đã giao', Returned: 'Hoàn hàng', Cancelled: 'Đã hủy',</w:t>
+        <w:br/>
+        <w:t>};</w:t>
+        <w:br/>
+        <w:t>function canCancel(order) {</w:t>
+        <w:br/>
+        <w:t xml:space="preserve">  return ['Pending', 'Processing'].includes(order.orderStatus);</w:t>
+        <w:br/>
+        <w:t>}</w:t>
+        <w:br/>
+        <w:t>function paymentLabel(order) {</w:t>
+        <w:br/>
+        <w:t xml:space="preserve">  if (order.paymentStatus === 'Refunding') return '⏳ Chờ hoàn tiền';</w:t>
+        <w:br/>
+        <w:t xml:space="preserve">  if (order.paymentStatus === 'Refunded') return '✓ Đã hoàn tiền';</w:t>
+        <w:br/>
+        <w:t xml:space="preserve">  if (order.orderStatus === 'Cancelled' &amp;&amp; order.paymentStatus !== 'Paid') return 'Đã hủy';</w:t>
+        <w:br/>
+        <w:t xml:space="preserve">  if (order.paymentStatus === 'Paid') return '✓ Đã thanh toán';</w:t>
+        <w:br/>
+        <w:t xml:space="preserve">  return order.paymentMethod === 'BANK_TRANSFER' ? 'Chờ chuyển khoản' : 'Chưa thu tiền (COD)';</w:t>
+        <w:br/>
+        <w:t>}</w:t>
+        <w:br/>
+        <w:br/>
+        <w:t>useEffect(() =&gt; {</w:t>
+        <w:br/>
+        <w:t xml:space="preserve">  if (!user) return;</w:t>
+        <w:br/>
+        <w:t xml:space="preserve">  orderService.getMyOrders()</w:t>
+        <w:br/>
+        <w:t xml:space="preserve">    .then((data) =&gt; setOrders(Array.isArray(data) ? data : []))</w:t>
+        <w:br/>
+        <w:t xml:space="preserve">    .catch(() =&gt; setError('Không thể tải đơn hàng.'))</w:t>
+        <w:br/>
+        <w:t xml:space="preserve">    .finally(() =&gt; setLoading(false));</w:t>
+        <w:br/>
+        <w:t>}, [user]);</w:t>
+        <w:br/>
+        <w:br/>
+        <w:t>async function cancelOrder(order) {</w:t>
+        <w:br/>
+        <w:t xml:space="preserve">  if (!canCancel(order)) return;</w:t>
+        <w:br/>
+        <w:t xml:space="preserve">  const updated = await orderService.cancelOrder(order._id);</w:t>
+        <w:br/>
+        <w:t xml:space="preserve">  setOrders((current) =&gt; current.map((item) =&gt; item._id === order._id</w:t>
+        <w:br/>
+        <w:t xml:space="preserve">    ? { ...item, ...updated } : item));</w:t>
+        <w:br/>
+        <w:t>}</w:t>
+        <w:br/>
+        <w:br/>
+        <w:t>/* server/src/routes/orderRoutes.js */</w:t>
+        <w:br/>
+        <w:t>router.get('/my-orders', orderController.getMyOrders);</w:t>
+        <w:br/>
+        <w:t>router.patch('/:id/cancel', orderController.cancelMyOrder);</w:t>
       </w:r>
     </w:p>
     <w:p>
       <w:pPr>
         <w:pStyle w:val="Heading2"/>
       </w:pPr>
+      <w:bookmarkStart w:id="29" w:name="contents_section_029"/>
       <w:r>
         <w:rPr>
           <w:rFonts w:ascii="Arial" w:hAnsi="Arial"/>
@@ -7568,6 +9746,7 @@
         </w:rPr>
         <w:t>9. ORDER REVIEW PAGE – /orders/:orderId/review</w:t>
       </w:r>
+      <w:bookmarkEnd w:id="29"/>
     </w:p>
     <w:p>
       <w:pPr>
@@ -7990,21 +10169,81 @@
       <w:r>
         <w:rPr>
           <w:rFonts w:ascii="Consolas" w:hAnsi="Consolas"/>
-          <w:b w:val="0"/>
           <w:color w:val="000000"/>
           <w:sz w:val="16"/>
         </w:rPr>
-        <w:t>if (order.orderStatus !== "Delivered" || order.paymentStatus !== "Paid") {</w:t>
-        <w:br/>
-        <w:t xml:space="preserve">  throw createError("Only a delivered paid order can review", 403);</w:t>
+        <w:t>/* client/src/pages/OrderReviewPage.jsx */</w:t>
+        <w:br/>
+        <w:t>useEffect(() =&gt; {</w:t>
+        <w:br/>
+        <w:t xml:space="preserve">  let active = true;</w:t>
+        <w:br/>
+        <w:t xml:space="preserve">  reviewService.getOrderReviewStatus(orderId)</w:t>
+        <w:br/>
+        <w:t xml:space="preserve">    .then((data) =&gt; {</w:t>
+        <w:br/>
+        <w:t xml:space="preserve">      if (!active) return;</w:t>
+        <w:br/>
+        <w:t xml:space="preserve">      setOrder(data);</w:t>
+        <w:br/>
+        <w:t xml:space="preserve">      setForms(Object.fromEntries(data.items.map((item) =&gt; [item.productId, {</w:t>
+        <w:br/>
+        <w:t xml:space="preserve">        rating: item.review?.rating || 5, comment: item.review?.comment || '',</w:t>
+        <w:br/>
+        <w:t xml:space="preserve">        submitted: item.reviewed, sending: false, error: '',</w:t>
+        <w:br/>
+        <w:t xml:space="preserve">      }])));</w:t>
+        <w:br/>
+        <w:t xml:space="preserve">    })</w:t>
+        <w:br/>
+        <w:t xml:space="preserve">    .finally(() =&gt; { if (active) setLoading(false); });</w:t>
+        <w:br/>
+        <w:t xml:space="preserve">  return () =&gt; { active = false; };</w:t>
+        <w:br/>
+        <w:t>}, [orderId]);</w:t>
+        <w:br/>
+        <w:br/>
+        <w:t>async function submitReview(item) {</w:t>
+        <w:br/>
+        <w:t xml:space="preserve">  const form = forms[item.productId];</w:t>
+        <w:br/>
+        <w:t xml:space="preserve">  if (!form || form.submitted || form.sending) return;</w:t>
+        <w:br/>
+        <w:t xml:space="preserve">  const comment = form.comment.trim();</w:t>
+        <w:br/>
+        <w:t xml:space="preserve">  if (!comment) return updateForm(item.productId, { error: 'Vui lòng nhập nội dung đánh giá.' });</w:t>
+        <w:br/>
+        <w:t xml:space="preserve">  updateForm(item.productId, { sending: true, error: '' });</w:t>
+        <w:br/>
+        <w:t xml:space="preserve">  try {</w:t>
+        <w:br/>
+        <w:t xml:space="preserve">    await reviewService.addOrderReview(orderId, item.productId, { rating: form.rating, comment });</w:t>
+        <w:br/>
+        <w:t xml:space="preserve">    updateForm(item.productId, { submitted: true, sending: false });</w:t>
+        <w:br/>
+        <w:t xml:space="preserve">  } catch (error) { updateForm(item.productId, { sending: false, error: messageOf(error, 'Không thể gửi đánh giá.') }); }</w:t>
         <w:br/>
         <w:t>}</w:t>
+        <w:br/>
+        <w:br/>
+        <w:t>/* server/src/controllers/reviewController.js */</w:t>
+        <w:br/>
+        <w:t>const order = await Order.findOne({ user: req.user._id,</w:t>
+        <w:br/>
+        <w:t xml:space="preserve">  orderStatus: 'Delivered', paymentStatus: 'Paid',</w:t>
+        <w:br/>
+        <w:t xml:space="preserve">  'orderItems.product': productId });</w:t>
+        <w:br/>
+        <w:t>if (!order) throw createError('Chỉ khách đã thanh toán và nhận sản phẩm mới có thể đánh giá.', 403);</w:t>
+        <w:br/>
+        <w:t>const existing = await Review.findOne({ user: userId, product: productId, order: orderId });</w:t>
       </w:r>
     </w:p>
     <w:p>
       <w:pPr>
         <w:pStyle w:val="Heading2"/>
       </w:pPr>
+      <w:bookmarkStart w:id="30" w:name="contents_section_030"/>
       <w:r>
         <w:rPr>
           <w:rFonts w:ascii="Arial" w:hAnsi="Arial"/>
@@ -8013,6 +10252,7 @@
         </w:rPr>
         <w:t>10. ROOM STUDIO PAGE – /room-studio</w:t>
       </w:r>
+      <w:bookmarkEnd w:id="30"/>
     </w:p>
     <w:p>
       <w:pPr>
@@ -8435,19 +10675,107 @@
       <w:r>
         <w:rPr>
           <w:rFonts w:ascii="Consolas" w:hAnsi="Consolas"/>
-          <w:b w:val="0"/>
           <w:color w:val="000000"/>
           <w:sz w:val="16"/>
         </w:rPr>
-        <w:t>const result = await createRoomPreview({ roomImageDataUrl, inspirationProducts, userPrompt });</w:t>
-        <w:br/>
-        <w:t>setGeneratedImage(result.image);</w:t>
+        <w:t>/* client/src/pages/RoomStudioPage.jsx */</w:t>
+        <w:br/>
+        <w:t>const MAX_PRODUCTS = 3;</w:t>
+        <w:br/>
+        <w:t>const idOf = (product) =&gt; String(product?._id || product?.id || '');</w:t>
+        <w:br/>
+        <w:t>const productImage = (product) =&gt; product?.transparentImage || product?.image || product?.sourceImages?.[0] || '';</w:t>
+        <w:br/>
+        <w:br/>
+        <w:t>function toDataUrl(file) {</w:t>
+        <w:br/>
+        <w:t xml:space="preserve">  return new Promise((resolve, reject) =&gt; {</w:t>
+        <w:br/>
+        <w:t xml:space="preserve">    const reader = new FileReader();</w:t>
+        <w:br/>
+        <w:t xml:space="preserve">    reader.onload = () =&gt; resolve(String(reader.result));</w:t>
+        <w:br/>
+        <w:t xml:space="preserve">    reader.onerror = () =&gt; reject(new Error('Không thể đọc ảnh.'));</w:t>
+        <w:br/>
+        <w:t xml:space="preserve">    reader.readAsDataURL(file);</w:t>
+        <w:br/>
+        <w:t xml:space="preserve">  });</w:t>
+        <w:br/>
+        <w:t>}</w:t>
+        <w:br/>
+        <w:br/>
+        <w:t>const selectedProducts = useMemo(() =&gt; selectedIds</w:t>
+        <w:br/>
+        <w:t xml:space="preserve">  .map((id) =&gt; products.find((product) =&gt; idOf(product) === String(id)))</w:t>
+        <w:br/>
+        <w:t xml:space="preserve">  .filter(Boolean), [products, selectedIds]);</w:t>
+        <w:br/>
+        <w:br/>
+        <w:t>const generate = async () =&gt; {</w:t>
+        <w:br/>
+        <w:t xml:space="preserve">  if (!roomImage) return setMessage('Bạn cần tải ảnh phòng ở Bước 2 trước khi gửi.');</w:t>
+        <w:br/>
+        <w:t xml:space="preserve">  if (!selectedProducts.length) return setMessage('Hãy chọn ít nhất một sản phẩm ở Bước 1.');</w:t>
+        <w:br/>
+        <w:t xml:space="preserve">  setGenerating(true);</w:t>
+        <w:br/>
+        <w:t xml:space="preserve">  try {</w:t>
+        <w:br/>
+        <w:t xml:space="preserve">    const inspirationProducts = await Promise.all(selectedProducts.map(async (product) =&gt; ({</w:t>
+        <w:br/>
+        <w:t xml:space="preserve">      productId: idOf(product), productName: product.name,</w:t>
+        <w:br/>
+        <w:t xml:space="preserve">      image: await imageUrlToDataUrl(productImage(product)),</w:t>
+        <w:br/>
+        <w:t xml:space="preserve">      desiredPosition: desiredPositions[idOf(product)] || '', ...productFacts(product),</w:t>
+        <w:br/>
+        <w:t xml:space="preserve">    })));</w:t>
+        <w:br/>
+        <w:t xml:space="preserve">    const data = await createRoomPreview({ roomImageDataUrl: roomImage,</w:t>
+        <w:br/>
+        <w:t xml:space="preserve">      imageSize: roomImageSize, mode: 'inspiration', inspirationProducts });</w:t>
+        <w:br/>
+        <w:t xml:space="preserve">    const generated = data?.imageDataUrl || data?.resultImage || data?.imageUrl;</w:t>
+        <w:br/>
+        <w:t xml:space="preserve">    if (!generated) throw new Error('AI chưa trả về ảnh.');</w:t>
+        <w:br/>
+        <w:t xml:space="preserve">    setResultImage(generated);</w:t>
+        <w:br/>
+        <w:t xml:space="preserve">    setMessage('Ảnh đã tạo xong.');</w:t>
+        <w:br/>
+        <w:t xml:space="preserve">  } catch (error) {</w:t>
+        <w:br/>
+        <w:t xml:space="preserve">    setResultImage('');</w:t>
+        <w:br/>
+        <w:t xml:space="preserve">    setMessage(error.message || 'Không thể tạo ảnh. Vui lòng thử lại.');</w:t>
+        <w:br/>
+        <w:t xml:space="preserve">  }</w:t>
+        <w:br/>
+        <w:t xml:space="preserve">  finally { setGenerating(false); }</w:t>
+        <w:br/>
+        <w:t>};</w:t>
+        <w:br/>
+        <w:br/>
+        <w:t>/* server/src/routes/roomPreviewRoutes.js */</w:t>
+        <w:br/>
+        <w:t>router.post('/', optionalAuthenticate, roomPreviewController.create);</w:t>
+        <w:br/>
+        <w:t>/* server/src/controllers/roomPreviewController.js */</w:t>
+        <w:br/>
+        <w:t>const result = await imageService.generateRoomPreview({</w:t>
+        <w:br/>
+        <w:t xml:space="preserve">  roomImageDataUrl: req.body.roomImageDataUrl, imageSize: req.body.imageSize,</w:t>
+        <w:br/>
+        <w:t xml:space="preserve">  products: validate(req.body), userPrompt: cleanText(req.body.userPrompt, 500),</w:t>
+        <w:br/>
+        <w:t>});</w:t>
       </w:r>
     </w:p>
     <w:p>
       <w:pPr>
         <w:pStyle w:val="Heading2"/>
       </w:pPr>
+      <w:bookmarkStart w:id="31" w:name="contents_section_031"/>
       <w:r>
         <w:rPr>
           <w:rFonts w:ascii="Arial" w:hAnsi="Arial"/>
@@ -8456,6 +10784,7 @@
         </w:rPr>
         <w:t>11. PROFILE PAGE – /profile</w:t>
       </w:r>
+      <w:bookmarkEnd w:id="31"/>
     </w:p>
     <w:p>
       <w:pPr>
@@ -8677,15 +11006,8 @@
             <w:vAlign w:val="center"/>
           </w:tcPr>
           <w:p>
-            <w:r/>
-            <w:r>
-              <w:rPr>
-                <w:rFonts w:ascii="Arial" w:hAnsi="Arial"/>
-                <w:b w:val="0"/>
-                <w:color w:val="000000"/>
-                <w:sz w:val="17"/>
-              </w:rPr>
-              <w:t>ProfilePage.jsx → userService → GET/PATCH /api/users/me and POST /api/users/me/password</w:t>
+            <w:r>
+              <w:t>ProfilePage.jsx → userService.getMe/updateMe → GET/PATCH /api/users/me; authService OTP → /api/auth/forgot-password/...</w:t>
             </w:r>
           </w:p>
         </w:tc>
@@ -8800,15 +11122,8 @@
             <w:vAlign w:val="center"/>
           </w:tcPr>
           <w:p>
-            <w:r/>
-            <w:r>
-              <w:rPr>
-                <w:rFonts w:ascii="Arial" w:hAnsi="Arial"/>
-                <w:b w:val="0"/>
-                <w:color w:val="000000"/>
-                <w:sz w:val="17"/>
-              </w:rPr>
-              <w:t>client/src/pages/ProfilePage.jsx; userController.js; User.js</w:t>
+            <w:r>
+              <w:t>client/src/pages/ProfilePage.jsx; userService.js; authService.js; userController.js; authController.js; User.js</w:t>
             </w:r>
           </w:p>
         </w:tc>
@@ -8878,23 +11193,90 @@
       <w:r>
         <w:rPr>
           <w:rFonts w:ascii="Consolas" w:hAnsi="Consolas"/>
-          <w:b w:val="0"/>
           <w:color w:val="000000"/>
           <w:sz w:val="16"/>
         </w:rPr>
-        <w:t>if (password !== confirmPassword) {</w:t>
-        <w:br/>
-        <w:t xml:space="preserve">  setError("Mật khẩu nhập lại chưa khớp.");</w:t>
-        <w:br/>
-        <w:t xml:space="preserve">  return;</w:t>
+        <w:t>/* client/src/pages/ProfilePage.jsx */</w:t>
+        <w:br/>
+        <w:t>async function saveProfile(event) {</w:t>
+        <w:br/>
+        <w:t xml:space="preserve">  event.preventDefault();</w:t>
+        <w:br/>
+        <w:t xml:space="preserve">  const phoneCheck = validateVietnamPhone(phone);</w:t>
+        <w:br/>
+        <w:t xml:space="preserve">  if (!phoneCheck.isValid) return setError(phoneCheck.message);</w:t>
+        <w:br/>
+        <w:t xml:space="preserve">  const addressCheck = validateSpecificAddress(address);</w:t>
+        <w:br/>
+        <w:t xml:space="preserve">  if (!addressCheck.isValid) return setError(addressCheck.message);</w:t>
+        <w:br/>
+        <w:t xml:space="preserve">  if (!districtCode || !wardCode) return setError('Vui lòng chọn quận/huyện và phường/xã.');</w:t>
+        <w:br/>
+        <w:t xml:space="preserve">  const selectedDistrict = districts.find((item) =&gt; String(item.code) === String(districtCode));</w:t>
+        <w:br/>
+        <w:t xml:space="preserve">  const selectedWard = wards.find((item) =&gt; String(item.code) === String(wardCode));</w:t>
+        <w:br/>
+        <w:t xml:space="preserve">  await updateProfile({ name: name.trim(), phone: phoneCheck.cleanPhone,</w:t>
+        <w:br/>
+        <w:t xml:space="preserve">    address: addressCheck.address, provinceCode: Number(provinceCode),</w:t>
+        <w:br/>
+        <w:t xml:space="preserve">    districtCode: Number(districtCode), districtName: selectedDistrict?.name || districtName,</w:t>
+        <w:br/>
+        <w:t xml:space="preserve">    wardCode: Number(wardCode), wardName: selectedWard?.name || wardName,</w:t>
+        <w:br/>
+        <w:t xml:space="preserve">    deliveryNote: deliveryNote.trim() });</w:t>
         <w:br/>
         <w:t>}</w:t>
+        <w:br/>
+        <w:br/>
+        <w:t>/* OTP đổi mật khẩu qua email */</w:t>
+        <w:br/>
+        <w:t>async function handleSendOtp() {</w:t>
+        <w:br/>
+        <w:t xml:space="preserve">  const response = await authService.requestPasswordReset(user.email);</w:t>
+        <w:br/>
+        <w:t xml:space="preserve">  setOtpSent(true);</w:t>
+        <w:br/>
+        <w:t xml:space="preserve">  setMessage(response?.devOtp ? `Đã gửi mã! (Mã thử nghiệm: ${response.devOtp})` : 'Mã xác minh đã được gửi về Gmail của bạn.');</w:t>
+        <w:br/>
+        <w:t>}</w:t>
+        <w:br/>
+        <w:br/>
+        <w:t>async function handleResetPassword(event) {</w:t>
+        <w:br/>
+        <w:t xml:space="preserve">  event.preventDefault();</w:t>
+        <w:br/>
+        <w:t xml:space="preserve">  if (newPassword !== confirmPassword) {</w:t>
+        <w:br/>
+        <w:t xml:space="preserve">    setError('Mật khẩu nhập lại chưa khớp.');</w:t>
+        <w:br/>
+        <w:t xml:space="preserve">    return;</w:t>
+        <w:br/>
+        <w:t xml:space="preserve">  }</w:t>
+        <w:br/>
+        <w:t xml:space="preserve">  await authService.resetPassword({ email: user.email, otp: otp.trim(), password: newPassword });</w:t>
+        <w:br/>
+        <w:t xml:space="preserve">  setOtpSent(false);</w:t>
+        <w:br/>
+        <w:t>}</w:t>
+        <w:br/>
+        <w:br/>
+        <w:t>/* client/src/services/userService.js */</w:t>
+        <w:br/>
+        <w:t>async updateMe(profile) { return dataOf(await apiClient.patch('/users/me', profile)); }</w:t>
+        <w:br/>
+        <w:t>/* server/src/routes/userRoutes.js */</w:t>
+        <w:br/>
+        <w:t>router.use(authenticate);</w:t>
+        <w:br/>
+        <w:t>router.patch('/me', userController.updateMe);</w:t>
       </w:r>
     </w:p>
     <w:p>
       <w:pPr>
         <w:pStyle w:val="Heading2"/>
       </w:pPr>
+      <w:bookmarkStart w:id="32" w:name="contents_section_032"/>
       <w:r>
         <w:rPr>
           <w:rFonts w:ascii="Arial" w:hAnsi="Arial"/>
@@ -8903,6 +11285,7 @@
         </w:rPr>
         <w:t>12. FEEDBACK PAGE – /feedback</w:t>
       </w:r>
+      <w:bookmarkEnd w:id="32"/>
     </w:p>
     <w:p>
       <w:pPr>
@@ -9325,19 +11708,78 @@
       <w:r>
         <w:rPr>
           <w:rFonts w:ascii="Consolas" w:hAnsi="Consolas"/>
-          <w:b w:val="0"/>
           <w:color w:val="000000"/>
           <w:sz w:val="16"/>
         </w:rPr>
-        <w:t>await feedbackService.create({ type, targetType, targetId, targetName, content });</w:t>
-        <w:br/>
-        <w:t>setMessage("Đã gửi phản hồi.");</w:t>
+        <w:t>/* client/src/pages/FeedbackPage.jsx */</w:t>
+        <w:br/>
+        <w:t>const submit = async (event) =&gt; {</w:t>
+        <w:br/>
+        <w:t xml:space="preserve">  event.preventDefault();</w:t>
+        <w:br/>
+        <w:t xml:space="preserve">  setMessage('');</w:t>
+        <w:br/>
+        <w:t xml:space="preserve">  setError('');</w:t>
+        <w:br/>
+        <w:t xml:space="preserve">  setIsSending(true);</w:t>
+        <w:br/>
+        <w:t xml:space="preserve">  try {</w:t>
+        <w:br/>
+        <w:t xml:space="preserve">    await feedbackService.create({</w:t>
+        <w:br/>
+        <w:t xml:space="preserve">      type: 'report',</w:t>
+        <w:br/>
+        <w:t xml:space="preserve">      content: content.trim(),</w:t>
+        <w:br/>
+        <w:t xml:space="preserve">      targetType: 'product',</w:t>
+        <w:br/>
+        <w:t xml:space="preserve">      targetId: reportedProduct?._id || reportedProduct?.id || '',</w:t>
+        <w:br/>
+        <w:t xml:space="preserve">      targetName: reportedProduct?.name || '',</w:t>
+        <w:br/>
+        <w:t xml:space="preserve">    });</w:t>
+        <w:br/>
+        <w:t xml:space="preserve">    setContent('');</w:t>
+        <w:br/>
+        <w:t xml:space="preserve">    setMessage('Đã gửi phản hồi.');</w:t>
+        <w:br/>
+        <w:t xml:space="preserve">  } catch (error) {</w:t>
+        <w:br/>
+        <w:t xml:space="preserve">    setError(error.response?.data?.message || error.message || 'Không thể gửi phản hồi.');</w:t>
+        <w:br/>
+        <w:t xml:space="preserve">  } finally { setIsSending(false); }</w:t>
+        <w:br/>
+        <w:t>};</w:t>
+        <w:br/>
+        <w:br/>
+        <w:t>/* client/src/services/feedbackService.js */</w:t>
+        <w:br/>
+        <w:t>async create(data) { return (await apiClient.post('/feedback', data)).data.data; }</w:t>
+        <w:br/>
+        <w:t>/* server/src/routes/feedbackRoutes.js */</w:t>
+        <w:br/>
+        <w:t>router.post('/', optionalAuthenticate, feedbackController.create);</w:t>
+        <w:br/>
+        <w:t>/* server/src/controllers/feedbackController.js */</w:t>
+        <w:br/>
+        <w:t>const type = String(req.body.type || '').trim();</w:t>
+        <w:br/>
+        <w:t>const content = String(req.body.content || '').trim();</w:t>
+        <w:br/>
+        <w:t>if (!['suggestion', 'report'].includes(type) || !content || content.length &gt; 2000) {</w:t>
+        <w:br/>
+        <w:t xml:space="preserve">  return res.status(400).json({ success: false, message: 'Nội dung góp ý không hợp lệ.', data: null });</w:t>
+        <w:br/>
+        <w:t>}</w:t>
+        <w:br/>
+        <w:t>const feedback = await Feedback.create({ user: req.user?._id || null, type, content });</w:t>
       </w:r>
     </w:p>
     <w:p>
       <w:pPr>
         <w:pStyle w:val="Heading2"/>
       </w:pPr>
+      <w:bookmarkStart w:id="33" w:name="contents_section_033"/>
       <w:r>
         <w:rPr>
           <w:rFonts w:ascii="Arial" w:hAnsi="Arial"/>
@@ -9346,6 +11788,7 @@
         </w:rPr>
         <w:t>13. ADMINISTRATION PAGE – /admin</w:t>
       </w:r>
+      <w:bookmarkEnd w:id="33"/>
     </w:p>
     <w:p>
       <w:pPr>
@@ -9768,19 +12211,83 @@
       <w:r>
         <w:rPr>
           <w:rFonts w:ascii="Consolas" w:hAnsi="Consolas"/>
-          <w:b w:val="0"/>
           <w:color w:val="000000"/>
           <w:sz w:val="16"/>
         </w:rPr>
-        <w:t>if (user?.role === "admin" || user?.role === "superadmin") return &lt;AdminPage /&gt;;</w:t>
-        <w:br/>
-        <w:t>return &lt;AccessDenied /&gt;;</w:t>
+        <w:t>/* client/src/pages/AdminPage.jsx */</w:t>
+        <w:br/>
+        <w:t>const isSuperadmin = user?.role === 'superadmin';</w:t>
+        <w:br/>
+        <w:br/>
+        <w:t>function productFromForm(form) {</w:t>
+        <w:br/>
+        <w:t xml:space="preserve">  return { name: form.name.trim(), categoryName: form.categoryName.trim(),</w:t>
+        <w:br/>
+        <w:t xml:space="preserve">    price: Number(form.price) || 0,</w:t>
+        <w:br/>
+        <w:t xml:space="preserve">    stock: Math.max(0, Math.round(Number(form.stock) || 0)),</w:t>
+        <w:br/>
+        <w:t xml:space="preserve">    description: form.description.trim() };</w:t>
+        <w:br/>
+        <w:t>}</w:t>
+        <w:br/>
+        <w:br/>
+        <w:t>async function saveProduct(event) {</w:t>
+        <w:br/>
+        <w:t xml:space="preserve">  event.preventDefault();</w:t>
+        <w:br/>
+        <w:t xml:space="preserve">  if (!form.name.trim() || !form.categoryName.trim()) return setError('Nhập tên và danh mục sản phẩm.');</w:t>
+        <w:br/>
+        <w:t xml:space="preserve">  setWorking(true);</w:t>
+        <w:br/>
+        <w:t xml:space="preserve">  try {</w:t>
+        <w:br/>
+        <w:t xml:space="preserve">    const data = productFromForm(form);</w:t>
+        <w:br/>
+        <w:t xml:space="preserve">    if (editingId) await updateProduct(editingId, data);</w:t>
+        <w:br/>
+        <w:t xml:space="preserve">    else await addProduct(data);</w:t>
+        <w:br/>
+        <w:t xml:space="preserve">    setNotice(editingId ? 'Đã cập nhật sản phẩm.' : 'Đã thêm sản phẩm.');</w:t>
+        <w:br/>
+        <w:t xml:space="preserve">  } finally { setWorking(false); }</w:t>
+        <w:br/>
+        <w:t>}</w:t>
+        <w:br/>
+        <w:br/>
+        <w:t>async function updateOrder(id, changes) {</w:t>
+        <w:br/>
+        <w:t xml:space="preserve">  const saved = await orderService.updateOrderStatus(id, changes);</w:t>
+        <w:br/>
+        <w:t xml:space="preserve">  setOrders((current) =&gt; current.map((order) =&gt; order._id === id ? saved : order));</w:t>
+        <w:br/>
+        <w:t>}</w:t>
+        <w:br/>
+        <w:br/>
+        <w:t>/* server/src/routes/adminRoutes.js */</w:t>
+        <w:br/>
+        <w:t>router.use(authenticate, requireAdmin);</w:t>
+        <w:br/>
+        <w:t>router.get('/users', adminController.listUsers);</w:t>
+        <w:br/>
+        <w:t>router.patch('/users/:id', adminController.updateUser);</w:t>
+        <w:br/>
+        <w:t>/* server/src/middleware/authMiddleware.js */</w:t>
+        <w:br/>
+        <w:t>if (!['admin', 'superadmin'].includes(req.user?.role)) {</w:t>
+        <w:br/>
+        <w:t xml:space="preserve">  return res.status(403).json({ success: false, message: 'Bạn không có quyền quản trị.' });</w:t>
+        <w:br/>
+        <w:t>}</w:t>
+        <w:br/>
+        <w:t>return next();</w:t>
       </w:r>
     </w:p>
     <w:p>
       <w:pPr>
         <w:pStyle w:val="Heading2"/>
       </w:pPr>
+      <w:bookmarkStart w:id="34" w:name="contents_section_034"/>
       <w:r>
         <w:rPr>
           <w:rFonts w:ascii="Arial" w:hAnsi="Arial"/>
@@ -9789,6 +12296,7 @@
         </w:rPr>
         <w:t>14. NOT FOUND PAGE – *</w:t>
       </w:r>
+      <w:bookmarkEnd w:id="34"/>
     </w:p>
     <w:p>
       <w:pPr>
@@ -10211,17 +12719,77 @@
       <w:r>
         <w:rPr>
           <w:rFonts w:ascii="Consolas" w:hAnsi="Consolas"/>
-          <w:b w:val="0"/>
           <w:color w:val="000000"/>
           <w:sz w:val="16"/>
         </w:rPr>
-        <w:t>{ path: "*", element: &lt;NotFoundPage /&gt; }</w:t>
+        <w:t>/* client/src/router.jsx */</w:t>
+        <w:br/>
+        <w:t>function AdminRoute() {</w:t>
+        <w:br/>
+        <w:t xml:space="preserve">  const { user, openLogin } = useAuth();</w:t>
+        <w:br/>
+        <w:t xml:space="preserve">  if (user?.role === 'admin' || user?.role === 'superadmin') return &lt;AdminPage /&gt;;</w:t>
+        <w:br/>
+        <w:t xml:space="preserve">  return &lt;main className="container page access-denied"&gt;</w:t>
+        <w:br/>
+        <w:t xml:space="preserve">    &lt;h1&gt;Khu vực quản trị&lt;/h1&gt;</w:t>
+        <w:br/>
+        <w:t xml:space="preserve">    &lt;p&gt;Đăng nhập bằng tài khoản quản trị để tiếp tục.&lt;/p&gt;</w:t>
+        <w:br/>
+        <w:t xml:space="preserve">    &lt;button className="button" type="button" onClick={() =&gt; openLogin('login')}&gt;Đăng nhập&lt;/button&gt;</w:t>
+        <w:br/>
+        <w:t xml:space="preserve">  &lt;/main&gt;;</w:t>
+        <w:br/>
+        <w:t>}</w:t>
+        <w:br/>
+        <w:br/>
+        <w:t>const router = createBrowserRouter([{</w:t>
+        <w:br/>
+        <w:t xml:space="preserve">  element: &lt;MainLayout /&gt;,</w:t>
+        <w:br/>
+        <w:t xml:space="preserve">  children: [</w:t>
+        <w:br/>
+        <w:t xml:space="preserve">    { path: '/', element: &lt;HomePage /&gt; },</w:t>
+        <w:br/>
+        <w:t xml:space="preserve">    { path: '/products', element: &lt;ProductListPage /&gt; },</w:t>
+        <w:br/>
+        <w:t xml:space="preserve">    { path: '/products/:id', element: &lt;ProductDetailPage /&gt; },</w:t>
+        <w:br/>
+        <w:t xml:space="preserve">    { path: '/cart', element: &lt;CartPage /&gt; },</w:t>
+        <w:br/>
+        <w:t xml:space="preserve">    { path: '/checkout', element: &lt;CheckoutPage /&gt; },</w:t>
+        <w:br/>
+        <w:t xml:space="preserve">    { path: '/orders', element: &lt;OrderHistoryPage /&gt; },</w:t>
+        <w:br/>
+        <w:t xml:space="preserve">    { path: '/orders/:orderId/review', element: &lt;OrderReviewPage /&gt; },</w:t>
+        <w:br/>
+        <w:t xml:space="preserve">    { path: '/room-studio', element: &lt;RoomStudioPage /&gt; },</w:t>
+        <w:br/>
+        <w:t xml:space="preserve">    { path: '/profile', element: &lt;ProfilePage /&gt; },</w:t>
+        <w:br/>
+        <w:t xml:space="preserve">    { path: '/feedback', element: &lt;FeedbackPage /&gt; },</w:t>
+        <w:br/>
+        <w:t xml:space="preserve">    { path: '/admin', element: &lt;AdminRoute /&gt; },</w:t>
+        <w:br/>
+        <w:t xml:space="preserve">    { path: '*', element: &lt;NotFoundPage /&gt; },</w:t>
+        <w:br/>
+        <w:t xml:space="preserve">  ],</w:t>
+        <w:br/>
+        <w:t>}]);</w:t>
+        <w:br/>
+        <w:br/>
+        <w:t>/* client/src/pages/NotFoundPage.jsx */</w:t>
+        <w:br/>
+        <w:t>&lt;Link className="button" to="/"&gt;Về trang chủ&lt;/Link&gt;</w:t>
+        <w:br/>
+        <w:t>&lt;Link className="button button-secondary" to="/products"&gt;Xem sản phẩm&lt;/Link&gt;</w:t>
       </w:r>
     </w:p>
     <w:p>
       <w:pPr>
         <w:pStyle w:val="Heading2"/>
       </w:pPr>
+      <w:bookmarkStart w:id="35" w:name="contents_section_035"/>
       <w:r>
         <w:rPr>
           <w:rFonts w:ascii="Arial" w:hAnsi="Arial"/>
@@ -10230,6 +12798,7 @@
         </w:rPr>
         <w:t>15. CROSS-PAGE BUSINESS RULES</w:t>
       </w:r>
+      <w:bookmarkEnd w:id="35"/>
     </w:p>
     <w:tbl>
       <w:tblPr>
@@ -10728,6 +13297,7 @@
       <w:pPr>
         <w:pStyle w:val="Heading2"/>
       </w:pPr>
+      <w:bookmarkStart w:id="36" w:name="contents_section_036"/>
       <w:r>
         <w:rPr>
           <w:rFonts w:ascii="Arial" w:hAnsi="Arial"/>
@@ -10736,6 +13306,7 @@
         </w:rPr>
         <w:t>16. CONCLUSION</w:t>
       </w:r>
+      <w:bookmarkEnd w:id="36"/>
     </w:p>
     <w:p>
       <w:r>

</xml_diff>